<commit_message>
Sync working tree: v2 course updates, assignments, decks, archify diagrams, prep and project files
Removes the retired v1 lessons/ tree and legacy decks; adds Week 1-2 assignments,
Day 3-5 archify diagrams, reference decks, and supporting scripts.

Co-Authored-By: Claude Sonnet 5 <noreply@anthropic.com>
</commit_message>
<xml_diff>
--- a/project/securecorp/SecureCorp-Engagement-v2.docx
+++ b/project/securecorp/SecureCorp-Engagement-v2.docx
@@ -56,11 +56,11 @@
         <w:rPr>
           <w:b/>
         </w:rPr>
-        <w:t xml:space="preserve">Version 2.0</w:t>
-      </w:r>
-      <w:r>
-        <w:rPr/>
-        <w:t xml:space="preserve"> — verified against VirtualBox 7.0/7.1 · Kali 2025.x · Metasploitable2 · DVWA v1.10 · Wazuh 4.9. Re-check tool versions before starting; installer commands change. What changed from v1 and why: see </w:t>
+        <w:t xml:space="preserve">Version 2.1</w:t>
+      </w:r>
+      <w:r>
+        <w:rPr/>
+        <w:t xml:space="preserve"> (2026-09-10) — verified against VirtualBox 7.0/7.1 · Kali 2025.x · Metasploitable2 · DVWA v1.10 · Wazuh 4.9. Re-check tool versions before starting; installer commands change. What changed from v1, and what v2.1 added: see </w:t>
       </w:r>
       <w:r>
         <w:rPr/>
@@ -1454,7 +1454,17 @@
       </w:r>
       <w:r>
         <w:rPr/>
-        <w:t xml:space="preserve"> · risk assessment, report, presentation.</w:t>
+        <w:t xml:space="preserve"> · risk assessment, report (every finding carrying CWE + CVSS), a one-page </w:t>
+      </w:r>
+      <w:r>
+        <w:rPr>
+          <w:b/>
+        </w:rPr>
+        <w:t xml:space="preserve">red/blue reflection</w:t>
+      </w:r>
+      <w:r>
+        <w:rPr/>
+        <w:t xml:space="preserve">, presentation.</w:t>
       </w:r>
     </w:p>
     <w:p>
@@ -1491,7 +1501,17 @@
       </w:r>
       <w:r>
         <w:rPr/>
-        <w:t xml:space="preserve"> and compare its detection to your manual analysis · one extra documented finding.</w:t>
+        <w:t xml:space="preserve"> and compare its detection to your manual analysis · document Task 2.3 as a </w:t>
+      </w:r>
+      <w:r>
+        <w:rPr>
+          <w:b/>
+        </w:rPr>
+        <w:t xml:space="preserve">kill chain</w:t>
+      </w:r>
+      <w:r>
+        <w:rPr/>
+        <w:t xml:space="preserve"> · one extra documented finding.</w:t>
       </w:r>
     </w:p>
     <w:p>
@@ -1510,17 +1530,25 @@
       </w:r>
       <w:r>
         <w:rPr/>
-        <w:t xml:space="preserve"> a Windows VM with a Wazuh agent · a </w:t>
-      </w:r>
-      <w:r>
-        <w:rPr>
-          <w:b/>
-        </w:rPr>
-        <w:t xml:space="preserve">custom Wazuh rule</w:t>
-      </w:r>
-      <w:r>
-        <w:rPr/>
-        <w:t xml:space="preserve"> that auto-detects one of your web attacks · an additional vulnerable service, assessed · a more advanced network design.</w:t>
+        <w:t xml:space="preserve"> a Windows VM with a Wazuh agent · </w:t>
+      </w:r>
+      <w:r>
+        <w:rPr>
+          <w:b/>
+        </w:rPr>
+        <w:t xml:space="preserve">detection engineering</w:t>
+      </w:r>
+      <w:r>
+        <w:rPr/>
+        <w:t xml:space="preserve"> — a custom Wazuh rule for </w:t>
+      </w:r>
+      <w:r>
+        <w:rPr/>
+        <w:t xml:space="preserve">every</w:t>
+      </w:r>
+      <w:r>
+        <w:rPr/>
+        <w:t xml:space="preserve"> activity that analysis left as Manual or Not Visible, with before/after evidence · an additional vulnerable service, assessed · a more advanced network design.</w:t>
       </w:r>
     </w:p>
     <w:p>
@@ -2542,6 +2570,51 @@
       <w:r>
         <w:rPr/>
         <w:t xml:space="preserve"> is your single source of truth for what to hand in.</w:t>
+      </w:r>
+    </w:p>
+    <w:p>
+      <w:pPr>
+        <w:ind w:left="284"/>
+        <w:jc w:val="both"/>
+        <w:spacing w:lineRule="auto"/>
+      </w:pPr>
+      <w:r>
+        <w:rPr>
+          <w:b/>
+        </w:rPr>
+        <w:t xml:space="preserve">Portfolio option (recommended, not graded).</w:t>
+      </w:r>
+      <w:r>
+        <w:rPr/>
+        <w:t xml:space="preserve"> Keep the whole engagement in a Git repository — a folder per week, your evidence files, the report, and any scripts you write. It doubles as version-control practice, and a public repo is something you can link on a CV: </w:t>
+      </w:r>
+      <w:r>
+        <w:rPr/>
+        <w:t xml:space="preserve">”authorized penetration test of an isolated lab — recon, real exploitation to shell, the DVWA web attacks, a CVSS-scored report with prioritized remediation.”</w:t>
+      </w:r>
+      <w:r>
+        <w:rPr/>
+        <w:t xml:space="preserve"> Two rules if you make it public: </w:t>
+      </w:r>
+      <w:r>
+        <w:rPr>
+          <w:b/>
+        </w:rPr>
+        <w:t xml:space="preserve">scrub anything that identifies your real home network</w:t>
+      </w:r>
+      <w:r>
+        <w:rPr/>
+        <w:t xml:space="preserve">, and </w:t>
+      </w:r>
+      <w:r>
+        <w:rPr>
+          <w:b/>
+        </w:rPr>
+        <w:t xml:space="preserve">never commit the seeded-incident answer key</w:t>
+      </w:r>
+      <w:r>
+        <w:rPr/>
+        <w:t xml:space="preserve"> your instructor gives you in Week 3.</w:t>
       </w:r>
     </w:p>
     <w:p>
@@ -5739,6 +5812,33 @@
     </w:p>
     <w:p>
       <w:pPr>
+        <w:numPr>
+          <w:ilvl w:val="0"/>
+          <w:numId w:val="11"/>
+        </w:numPr>
+        <w:spacing w:lineRule="auto"/>
+      </w:pPr>
+      <w:r>
+        <w:rPr/>
+        <w:t xml:space="preserve">(Challenge)</w:t>
+      </w:r>
+      <w:r>
+        <w:rPr/>
+        <w:t xml:space="preserve"> write this up as a </w:t>
+      </w:r>
+      <w:r>
+        <w:rPr>
+          <w:b/>
+        </w:rPr>
+        <w:t xml:space="preserve">kill chain</w:t>
+      </w:r>
+      <w:r>
+        <w:rPr/>
+        <w:t xml:space="preserve"> — initial access → discovery → privilege escalation → objective — with each step mapped to the lifecycle phase it belongs to. This is the difference between “did some exercises” and “demonstrated an end-to-end attack path”.</w:t>
+      </w:r>
+    </w:p>
+    <w:p>
+      <w:pPr>
         <w:spacing w:lineRule="auto"/>
       </w:pPr>
       <w:r>
@@ -5749,7 +5849,37 @@
       </w:r>
       <w:r>
         <w:rPr/>
-        <w:t xml:space="preserve"> the Standard Attack Evidence entry — the service, the CVE, the tool/PoC, the command, and a screenshot of the shell showing </w:t>
+        <w:t xml:space="preserve"> the Standard Attack Evidence entry — the service, its </w:t>
+      </w:r>
+      <w:r>
+        <w:rPr>
+          <w:b/>
+        </w:rPr>
+        <w:t xml:space="preserve">CVE</w:t>
+      </w:r>
+      <w:r>
+        <w:rPr/>
+        <w:t xml:space="preserve">, the </w:t>
+      </w:r>
+      <w:r>
+        <w:rPr>
+          <w:b/>
+        </w:rPr>
+        <w:t xml:space="preserve">CWE</w:t>
+      </w:r>
+      <w:r>
+        <w:rPr/>
+        <w:t xml:space="preserve"> class, a </w:t>
+      </w:r>
+      <w:r>
+        <w:rPr>
+          <w:b/>
+        </w:rPr>
+        <w:t xml:space="preserve">CVSS v3.1</w:t>
+      </w:r>
+      <w:r>
+        <w:rPr/>
+        <w:t xml:space="preserve"> score, the tool/PoC, the command, and a screenshot of the shell showing </w:t>
       </w:r>
       <w:r>
         <w:rPr/>
@@ -7584,16 +7714,109 @@
       </w:r>
       <w:r>
         <w:rPr/>
-        <w:t xml:space="preserve"> in plain terms — improving detection so important activity doesn’t go unnoticed.</w:t>
-      </w:r>
-    </w:p>
-    <w:p>
-      <w:pPr>
-        <w:spacing w:lineRule="auto"/>
-      </w:pPr>
-      <w:r>
-        <w:rPr/>
-        <w:t xml:space="preserve">(Challenge: deploy Wazuh, replay the same log data, and add a column — did Wazuh auto-alert on each? Compare its coverage to your manual analysis. Stretch: write one custom rule that auto-detects your DVWA command-injection attack.)</w:t>
+        <w:t xml:space="preserve"> in plain terms — improving detection so important activity doesn’t go unnoticed. These same notes feed your report’s </w:t>
+      </w:r>
+      <w:r>
+        <w:rPr>
+          <w:b/>
+        </w:rPr>
+        <w:t xml:space="preserve">Limitations</w:t>
+      </w:r>
+      <w:r>
+        <w:rPr/>
+        <w:t xml:space="preserve"> section (Appendix A §10) and the </w:t>
+      </w:r>
+      <w:r>
+        <w:rPr>
+          <w:b/>
+        </w:rPr>
+        <w:t xml:space="preserve">detective control</w:t>
+      </w:r>
+      <w:r>
+        <w:rPr/>
+        <w:t xml:space="preserve"> column of your recommendations (Task 4.1).</w:t>
+      </w:r>
+    </w:p>
+    <w:p>
+      <w:pPr>
+        <w:spacing w:lineRule="auto"/>
+      </w:pPr>
+      <w:r>
+        <w:rPr/>
+        <w:t xml:space="preserve">(Challenge: deploy Wazuh, replay the same log data, and add a column — did Wazuh auto-alert on each? Compare its coverage to your manual analysis.)</w:t>
+      </w:r>
+    </w:p>
+    <w:p>
+      <w:pPr>
+        <w:spacing w:lineRule="auto"/>
+      </w:pPr>
+      <w:r>
+        <w:rPr/>
+        <w:t xml:space="preserve">(Stretch — detection engineering: for </w:t>
+      </w:r>
+      <w:r>
+        <w:rPr>
+          <w:b/>
+        </w:rPr>
+        <w:t xml:space="preserve">every</w:t>
+      </w:r>
+      <w:r>
+        <w:rPr/>
+        <w:t xml:space="preserve"> activity that came back </w:t>
+      </w:r>
+      <w:r>
+        <w:rPr>
+          <w:b/>
+        </w:rPr>
+        <w:t xml:space="preserve">Manual</w:t>
+      </w:r>
+      <w:r>
+        <w:rPr/>
+        <w:t xml:space="preserve"> or </w:t>
+      </w:r>
+      <w:r>
+        <w:rPr>
+          <w:b/>
+        </w:rPr>
+        <w:t xml:space="preserve">Not Visible</w:t>
+      </w:r>
+      <w:r>
+        <w:rPr/>
+        <w:t xml:space="preserve">, write a custom Wazuh rule — a local decoder + rule in </w:t>
+      </w:r>
+      <w:r>
+        <w:rPr/>
+        <w:t xml:space="preserve">/var/ossec/etc/rules/local_rules.xml</w:t>
+      </w:r>
+      <w:r>
+        <w:rPr/>
+        <w:t xml:space="preserve"> — that turns it into an automatic alert. For example, a rule that alerts on an Apache log line containing </w:t>
+      </w:r>
+      <w:r>
+        <w:rPr/>
+        <w:t xml:space="preserve">' or 1=1</w:t>
+      </w:r>
+      <w:r>
+        <w:rPr/>
+        <w:t xml:space="preserve"> / </w:t>
+      </w:r>
+      <w:r>
+        <w:rPr/>
+        <w:t xml:space="preserve">union select</w:t>
+      </w:r>
+      <w:r>
+        <w:rPr/>
+        <w:t xml:space="preserve">, or one that groups 10+ failed FTP logins in 60 seconds. </w:t>
+      </w:r>
+      <w:r>
+        <w:rPr>
+          <w:b/>
+        </w:rPr>
+        <w:t xml:space="preserve">Deliverable:</w:t>
+      </w:r>
+      <w:r>
+        <w:rPr/>
+        <w:t xml:space="preserve"> the rule XML plus a before/after screenshot of the same attack replayed, now auto-alerting. This is the line on a CV that reads “authored custom SIEM detection rules covering SQLi, XSS, and credential attacks” instead of “used a SIEM”.)</w:t>
       </w:r>
     </w:p>
     <w:p>
@@ -7614,7 +7837,7 @@
         <w:rPr>
           <w:rFonts w:ascii="Courier" w:hAnsi="Courier"/>
         </w:rPr>
-        <w:t xml:space="preserve">☐  Coverage confirmation screenshot (Task 3.1) ☐  One detection note per Week 2 activity + the ten analyst answers (Task 3.2) ☐  Incident Report for the SEEDED activity: timeline, IOCs, classification, actions,      and which events were yours vs not (Task 3.3) ☐  Detection coverage notes (Task 3.4) ☐  (Challenge) Wazuh comparison column  (Stretch) one custom rule ☐  Progress note (3–4 bullets) </w:t>
+        <w:t xml:space="preserve">☐  Coverage confirmation screenshot (Task 3.1) ☐  One detection note per Week 2 activity + the ten analyst answers (Task 3.2) ☐  Incident Report for the SEEDED activity: timeline, IOCs, classification, actions,      and which events were yours vs not (Task 3.3) ☐  Detection coverage notes (Task 3.4) ☐  (Challenge) Wazuh comparison column  (Stretch) a custom rule per Manual/Not-Visible activity, with before/after evidence ☐  Progress note (3–4 bullets) </w:t>
       </w:r>
     </w:p>
     <w:p>
@@ -7675,6 +7898,873 @@
       <w:r>
         <w:rPr/>
         <w:t xml:space="preserve"> from Weeks 2–3 where possible. Explain why each matters.</w:t>
+      </w:r>
+    </w:p>
+    <w:p>
+      <w:pPr>
+        <w:spacing w:lineRule="auto"/>
+      </w:pPr>
+      <w:r>
+        <w:rPr/>
+        <w:t xml:space="preserve">For each recommendation, give the fix at </w:t>
+      </w:r>
+      <w:r>
+        <w:rPr>
+          <w:b/>
+        </w:rPr>
+        <w:t xml:space="preserve">three levels</w:t>
+      </w:r>
+      <w:r>
+        <w:rPr/>
+        <w:t xml:space="preserve"> where they apply:</w:t>
+      </w:r>
+    </w:p>
+    <w:p>
+      <w:pPr>
+        <w:numPr>
+          <w:ilvl w:val="0"/>
+          <w:numId w:val="18"/>
+        </w:numPr>
+        <w:spacing w:lineRule="auto"/>
+      </w:pPr>
+      <w:r>
+        <w:rPr>
+          <w:b/>
+        </w:rPr>
+        <w:t xml:space="preserve">Technical fix</w:t>
+      </w:r>
+      <w:r>
+        <w:rPr/>
+        <w:t xml:space="preserve"> — the real remediation: patch the service, validate/parameterize input, disable what isn’t needed.</w:t>
+      </w:r>
+    </w:p>
+    <w:p>
+      <w:pPr>
+        <w:numPr>
+          <w:ilvl w:val="0"/>
+          <w:numId w:val="18"/>
+        </w:numPr>
+        <w:spacing w:lineRule="auto"/>
+      </w:pPr>
+      <w:r>
+        <w:rPr>
+          <w:b/>
+        </w:rPr>
+        <w:t xml:space="preserve">Compensating control</w:t>
+      </w:r>
+      <w:r>
+        <w:rPr/>
+        <w:t xml:space="preserve"> — what reduces the risk when the fix can’t ship immediately: a WAF, rate limiting, network segmentation, MFA.</w:t>
+      </w:r>
+    </w:p>
+    <w:p>
+      <w:pPr>
+        <w:numPr>
+          <w:ilvl w:val="0"/>
+          <w:numId w:val="18"/>
+        </w:numPr>
+        <w:spacing w:lineRule="auto"/>
+      </w:pPr>
+      <w:r>
+        <w:rPr>
+          <w:b/>
+        </w:rPr>
+        <w:t xml:space="preserve">Detective control</w:t>
+      </w:r>
+      <w:r>
+        <w:rPr/>
+        <w:t xml:space="preserve"> — the log source or alert (ideally the Wazuh rule from Task 3.4) that tells SecureCorp it’s happening if it happens anyway.</w:t>
+      </w:r>
+    </w:p>
+    <w:tbl>
+      <w:tblPr>
+        <w:tblBorders>
+          <w:top w:val="single" w:sz="2" w:space="0" w:color="000000"/>
+          <w:bottom w:val="single" w:sz="2" w:space="0" w:color="000000"/>
+          <w:left w:val="single" w:sz="2" w:space="0" w:color="000000"/>
+          <w:right w:val="single" w:sz="2" w:space="0" w:color="000000"/>
+        </w:tblBorders>
+        <w:tblCellSpacing w:w="0" w:type="dxa"/>
+        <w:tblCellMar>
+          <w:top w:type="dxa" w:w="80"/>
+          <w:bottom w:type="dxa" w:w="80"/>
+          <w:left w:type="dxa" w:w="160"/>
+          <w:right w:type="dxa" w:w="160"/>
+        </w:tblCellMar>
+        <w:jc w:val="center"/>
+      </w:tblPr>
+      <w:tblGrid>
+        <w:gridCol w:w="1440"/>
+        <w:gridCol w:w="1440"/>
+        <w:gridCol w:w="1440"/>
+        <w:gridCol w:w="1440"/>
+        <w:gridCol w:w="1440"/>
+        <w:gridCol w:w="1440"/>
+      </w:tblGrid>
+      <w:tr>
+        <w:trPr/>
+        <w:tc>
+          <w:tcPr>
+            <w:tcBorders>
+              <w:top w:val="single" w:sz="1" w:space="0" w:color="000000"/>
+              <w:bottom w:val="single" w:sz="1" w:space="0" w:color="000000"/>
+              <w:left w:val="single" w:sz="1" w:space="0" w:color="000000"/>
+              <w:right w:val="single" w:sz="1" w:space="0" w:color="000000"/>
+            </w:tcBorders>
+          </w:tcPr>
+          <w:p>
+            <w:pPr>
+              <w:spacing w:lineRule="auto"/>
+            </w:pPr>
+            <w:r>
+              <w:rPr/>
+              <w:t xml:space="preserve">Area</w:t>
+            </w:r>
+          </w:p>
+        </w:tc>
+        <w:tc>
+          <w:tcPr>
+            <w:tcBorders>
+              <w:top w:val="single" w:sz="1" w:space="0" w:color="000000"/>
+              <w:bottom w:val="single" w:sz="1" w:space="0" w:color="000000"/>
+              <w:left w:val="single" w:sz="1" w:space="0" w:color="000000"/>
+              <w:right w:val="single" w:sz="1" w:space="0" w:color="000000"/>
+            </w:tcBorders>
+          </w:tcPr>
+          <w:p>
+            <w:pPr>
+              <w:spacing w:lineRule="auto"/>
+            </w:pPr>
+            <w:r>
+              <w:rPr/>
+              <w:t xml:space="preserve">Current state (evidence)</w:t>
+            </w:r>
+          </w:p>
+        </w:tc>
+        <w:tc>
+          <w:tcPr>
+            <w:tcBorders>
+              <w:top w:val="single" w:sz="1" w:space="0" w:color="000000"/>
+              <w:bottom w:val="single" w:sz="1" w:space="0" w:color="000000"/>
+              <w:left w:val="single" w:sz="1" w:space="0" w:color="000000"/>
+              <w:right w:val="single" w:sz="1" w:space="0" w:color="000000"/>
+            </w:tcBorders>
+          </w:tcPr>
+          <w:p>
+            <w:pPr>
+              <w:spacing w:lineRule="auto"/>
+            </w:pPr>
+            <w:r>
+              <w:rPr/>
+              <w:t xml:space="preserve">Technical fix</w:t>
+            </w:r>
+          </w:p>
+        </w:tc>
+        <w:tc>
+          <w:tcPr>
+            <w:tcBorders>
+              <w:top w:val="single" w:sz="1" w:space="0" w:color="000000"/>
+              <w:bottom w:val="single" w:sz="1" w:space="0" w:color="000000"/>
+              <w:left w:val="single" w:sz="1" w:space="0" w:color="000000"/>
+              <w:right w:val="single" w:sz="1" w:space="0" w:color="000000"/>
+            </w:tcBorders>
+          </w:tcPr>
+          <w:p>
+            <w:pPr>
+              <w:spacing w:lineRule="auto"/>
+            </w:pPr>
+            <w:r>
+              <w:rPr/>
+              <w:t xml:space="preserve">Compensating control</w:t>
+            </w:r>
+          </w:p>
+        </w:tc>
+        <w:tc>
+          <w:tcPr>
+            <w:tcBorders>
+              <w:top w:val="single" w:sz="1" w:space="0" w:color="000000"/>
+              <w:bottom w:val="single" w:sz="1" w:space="0" w:color="000000"/>
+              <w:left w:val="single" w:sz="1" w:space="0" w:color="000000"/>
+              <w:right w:val="single" w:sz="1" w:space="0" w:color="000000"/>
+            </w:tcBorders>
+          </w:tcPr>
+          <w:p>
+            <w:pPr>
+              <w:spacing w:lineRule="auto"/>
+            </w:pPr>
+            <w:r>
+              <w:rPr/>
+              <w:t xml:space="preserve">Detective control</w:t>
+            </w:r>
+          </w:p>
+        </w:tc>
+        <w:tc>
+          <w:tcPr>
+            <w:tcBorders>
+              <w:top w:val="single" w:sz="1" w:space="0" w:color="000000"/>
+              <w:bottom w:val="single" w:sz="1" w:space="0" w:color="000000"/>
+              <w:left w:val="single" w:sz="1" w:space="0" w:color="000000"/>
+              <w:right w:val="single" w:sz="1" w:space="0" w:color="000000"/>
+            </w:tcBorders>
+          </w:tcPr>
+          <w:p>
+            <w:pPr>
+              <w:spacing w:lineRule="auto"/>
+            </w:pPr>
+            <w:r>
+              <w:rPr/>
+              <w:t xml:space="preserve">Priority</w:t>
+            </w:r>
+          </w:p>
+        </w:tc>
+      </w:tr>
+    </w:tbl>
+    <w:p>
+      <w:pPr>
+        <w:spacing w:lineRule="auto"/>
+      </w:pPr>
+      <w:r>
+        <w:rPr/>
+      </w:r>
+    </w:p>
+    <w:p>
+      <w:pPr>
+        <w:pStyle w:val="Heading3"/>
+        <w:spacing w:lineRule="auto"/>
+      </w:pPr>
+      <w:r>
+        <w:rPr/>
+        <w:t xml:space="preserve">Task 4.2 — Executive Summary</w:t>
+      </w:r>
+    </w:p>
+    <w:p>
+      <w:pPr>
+        <w:spacing w:lineRule="auto"/>
+      </w:pPr>
+      <w:r>
+        <w:rPr>
+          <w:b/>
+        </w:rPr>
+        <w:t xml:space="preserve">Tasks:</w:t>
+      </w:r>
+      <w:r>
+        <w:rPr/>
+        <w:t xml:space="preserve"> one page — overall posture, the most critical findings, the highest business risks, your top recommendations. </w:t>
+      </w:r>
+      <w:r>
+        <w:rPr>
+          <w:b/>
+        </w:rPr>
+        <w:t xml:space="preserve">A non-technical manager must understand it</w:t>
+      </w:r>
+      <w:r>
+        <w:rPr/>
+        <w:t xml:space="preserve"> with none of the Week 2–3 detail. Do </w:t>
+      </w:r>
+      <w:r>
+        <w:rPr>
+          <w:b/>
+        </w:rPr>
+        <w:t xml:space="preserve">not</w:t>
+      </w:r>
+      <w:r>
+        <w:rPr/>
+        <w:t xml:space="preserve"> write it in the same technical language as the rest of the report.</w:t>
+      </w:r>
+    </w:p>
+    <w:p>
+      <w:pPr>
+        <w:pStyle w:val="Heading3"/>
+        <w:spacing w:lineRule="auto"/>
+      </w:pPr>
+      <w:r>
+        <w:rPr/>
+        <w:t xml:space="preserve">Task 4.3 — Final client debrief</w:t>
+      </w:r>
+    </w:p>
+    <w:p>
+      <w:pPr>
+        <w:spacing w:lineRule="auto"/>
+      </w:pPr>
+      <w:r>
+        <w:rPr>
+          <w:b/>
+        </w:rPr>
+        <w:t xml:space="preserve">Tasks:</w:t>
+      </w:r>
+      <w:r>
+        <w:rPr/>
+        <w:t xml:space="preserve"> a 10–15 minute presentation — posture, key findings, evidence (a live demo is optional), recommendations, lessons learned. Be ready for follow-up questions from “SecureCorp leadership” (your instructor / peers).</w:t>
+      </w:r>
+    </w:p>
+    <w:p>
+      <w:pPr>
+        <w:spacing w:lineRule="auto"/>
+      </w:pPr>
+      <w:r>
+        <w:rPr>
+          <w:b/>
+        </w:rPr>
+        <w:t xml:space="preserve">Expected Output:</w:t>
+      </w:r>
+      <w:r>
+        <w:rPr/>
+        <w:t xml:space="preserve"> a slide deck + the delivered presentation.</w:t>
+      </w:r>
+    </w:p>
+    <w:p>
+      <w:pPr>
+        <w:pStyle w:val="Heading3"/>
+        <w:spacing w:lineRule="auto"/>
+      </w:pPr>
+      <w:r>
+        <w:rPr/>
+        <w:t xml:space="preserve">Task 4.4 — Limitations &amp; Reflection</w:t>
+      </w:r>
+    </w:p>
+    <w:p>
+      <w:pPr>
+        <w:spacing w:lineRule="auto"/>
+      </w:pPr>
+      <w:r>
+        <w:rPr>
+          <w:b/>
+        </w:rPr>
+        <w:t xml:space="preserve">Objective:</w:t>
+      </w:r>
+      <w:r>
+        <w:rPr/>
+        <w:t xml:space="preserve"> show the maturity to state what your assessment </w:t>
+      </w:r>
+      <w:r>
+        <w:rPr/>
+        <w:t xml:space="preserve">didn’t</w:t>
+      </w:r>
+      <w:r>
+        <w:rPr/>
+        <w:t xml:space="preserve"> cover, and what switching sides taught you. Both come up in interviews.</w:t>
+      </w:r>
+    </w:p>
+    <w:p>
+      <w:pPr>
+        <w:spacing w:lineRule="auto"/>
+      </w:pPr>
+      <w:r>
+        <w:rPr>
+          <w:b/>
+        </w:rPr>
+        <w:t xml:space="preserve">Tasks</w:t>
+      </w:r>
+    </w:p>
+    <w:p>
+      <w:pPr>
+        <w:numPr>
+          <w:ilvl w:val="0"/>
+          <w:numId w:val="19"/>
+        </w:numPr>
+        <w:spacing w:lineRule="auto"/>
+      </w:pPr>
+      <w:r>
+        <w:rPr>
+          <w:b/>
+        </w:rPr>
+        <w:t xml:space="preserve">Limitations</w:t>
+      </w:r>
+      <w:r>
+        <w:rPr/>
+        <w:t xml:space="preserve"> (goes in the report — Appendix A §10). List what this engagement did not cover and why: services you didn’t test, DVWA security levels above </w:t>
+      </w:r>
+      <w:r>
+        <w:rPr/>
+        <w:t xml:space="preserve">low</w:t>
+      </w:r>
+      <w:r>
+        <w:rPr/>
+        <w:t xml:space="preserve"> if you stayed at Core, activity you know you’d have missed without the timestamps you recorded in Week 2, and anything an isolated lab can’t represent (real user behaviour, production scale, an EDR agent, a tuned SIEM). Pull the raw material straight from your Task 3.4 notes. A report that implies you found everything is </w:t>
+      </w:r>
+      <w:r>
+        <w:rPr/>
+        <w:t xml:space="preserve">less</w:t>
+      </w:r>
+      <w:r>
+        <w:rPr/>
+        <w:t xml:space="preserve"> credible, not more.</w:t>
+      </w:r>
+    </w:p>
+    <w:p>
+      <w:pPr>
+        <w:numPr>
+          <w:ilvl w:val="0"/>
+          <w:numId w:val="19"/>
+        </w:numPr>
+        <w:spacing w:lineRule="auto"/>
+      </w:pPr>
+      <w:r>
+        <w:rPr>
+          <w:b/>
+        </w:rPr>
+        <w:t xml:space="preserve">Reflection</w:t>
+      </w:r>
+      <w:r>
+        <w:rPr/>
+        <w:t xml:space="preserve"> (one page, its own deliverable). Answer, in prose:</w:t>
+      </w:r>
+    </w:p>
+    <w:p>
+      <w:pPr>
+        <w:numPr>
+          <w:ilvl w:val="1"/>
+          <w:numId w:val="20"/>
+        </w:numPr>
+        <w:spacing w:lineRule="auto"/>
+      </w:pPr>
+      <w:r>
+        <w:rPr/>
+        <w:t xml:space="preserve">You attacked SecureCorp, then investigated it. </w:t>
+      </w:r>
+      <w:r>
+        <w:rPr>
+          <w:b/>
+        </w:rPr>
+        <w:t xml:space="preserve">What did the attacker know that the defender didn’t?</w:t>
+      </w:r>
+    </w:p>
+    <w:p>
+      <w:pPr>
+        <w:numPr>
+          <w:ilvl w:val="1"/>
+          <w:numId w:val="20"/>
+        </w:numPr>
+        <w:spacing w:lineRule="auto"/>
+      </w:pPr>
+      <w:r>
+        <w:rPr>
+          <w:b/>
+        </w:rPr>
+        <w:t xml:space="preserve">Which of your attacks was hardest to detect, and why?</w:t>
+      </w:r>
+    </w:p>
+    <w:p>
+      <w:pPr>
+        <w:numPr>
+          <w:ilvl w:val="1"/>
+          <w:numId w:val="20"/>
+        </w:numPr>
+        <w:spacing w:lineRule="auto"/>
+      </w:pPr>
+      <w:r>
+        <w:rPr>
+          <w:b/>
+        </w:rPr>
+        <w:t xml:space="preserve">What did the seeded incident (Task 3.3) teach you that your own attacks didn’t?</w:t>
+      </w:r>
+    </w:p>
+    <w:p>
+      <w:pPr>
+        <w:spacing w:lineRule="auto"/>
+      </w:pPr>
+      <w:r>
+        <w:rPr>
+          <w:b/>
+        </w:rPr>
+        <w:t xml:space="preserve">Expected Output:</w:t>
+      </w:r>
+      <w:r>
+        <w:rPr/>
+        <w:t xml:space="preserve"> a Limitations section in the report, plus a one-page reflection — </w:t>
+      </w:r>
+      <w:r>
+        <w:rPr/>
+        <w:t xml:space="preserve">W4-T4.4-reflection.pdf</w:t>
+      </w:r>
+      <w:r>
+        <w:rPr/>
+        <w:t xml:space="preserve">.</w:t>
+      </w:r>
+    </w:p>
+    <w:p>
+      <w:pPr>
+        <w:spacing w:lineRule="auto"/>
+      </w:pPr>
+      <w:r>
+        <w:rPr>
+          <w:b/>
+        </w:rPr>
+        <w:t xml:space="preserve">Learning Outcome:</w:t>
+      </w:r>
+      <w:r>
+        <w:rPr/>
+        <w:t xml:space="preserve"> honest scoping, and the analyst mindset that comes from having sat in both chairs.</w:t>
+      </w:r>
+    </w:p>
+    <w:p>
+      <w:pPr>
+        <w:pStyle w:val="Heading3"/>
+        <w:spacing w:lineRule="auto"/>
+      </w:pPr>
+      <w:r>
+        <w:rPr/>
+        <w:t xml:space="preserve">Week 4 Deliverables</w:t>
+      </w:r>
+    </w:p>
+    <w:p>
+      <w:pPr>
+        <w:spacing w:lineRule="auto"/>
+      </w:pPr>
+      <w:r>
+        <w:rPr>
+          <w:rFonts w:ascii="Courier" w:hAnsi="Courier"/>
+        </w:rPr>
+        <w:t xml:space="preserve">☐  Security Recommendations — each tied to a finding, prioritized, with technical /      compensating / detective controls where they apply (4.1) ☐  Executive Summary — one page, non-technical (4.2) ☐  Final Presentation delivered (4.3) ☐  Limitations section in the report + one-page reflection (4.4) ☐  Progress note (3–4 bullets) </w:t>
+      </w:r>
+    </w:p>
+    <w:p>
+      <w:pPr>
+        <w:pStyle w:val="Heading2"/>
+        <w:spacing w:lineRule="auto"/>
+      </w:pPr>
+      <w:r>
+        <w:rPr/>
+        <w:t xml:space="preserve">Appendix A — Master Report Template</w:t>
+      </w:r>
+    </w:p>
+    <w:p>
+      <w:pPr>
+        <w:numPr>
+          <w:ilvl w:val="0"/>
+          <w:numId w:val="21"/>
+        </w:numPr>
+        <w:spacing w:lineRule="auto"/>
+      </w:pPr>
+      <w:r>
+        <w:rPr/>
+        <w:t xml:space="preserve">Cover page — engagement title, your name, date</w:t>
+      </w:r>
+    </w:p>
+    <w:p>
+      <w:pPr>
+        <w:numPr>
+          <w:ilvl w:val="0"/>
+          <w:numId w:val="21"/>
+        </w:numPr>
+        <w:spacing w:lineRule="auto"/>
+      </w:pPr>
+      <w:r>
+        <w:rPr/>
+        <w:t xml:space="preserve">Executive Summary (4.2)</w:t>
+      </w:r>
+    </w:p>
+    <w:p>
+      <w:pPr>
+        <w:numPr>
+          <w:ilvl w:val="0"/>
+          <w:numId w:val="21"/>
+        </w:numPr>
+        <w:spacing w:lineRule="auto"/>
+      </w:pPr>
+      <w:r>
+        <w:rPr/>
+        <w:t xml:space="preserve">Scope &amp; Rules of Engagement (§4)</w:t>
+      </w:r>
+    </w:p>
+    <w:p>
+      <w:pPr>
+        <w:numPr>
+          <w:ilvl w:val="0"/>
+          <w:numId w:val="21"/>
+        </w:numPr>
+        <w:spacing w:lineRule="auto"/>
+      </w:pPr>
+      <w:r>
+        <w:rPr/>
+        <w:t xml:space="preserve">Asset Inventory &amp; CIA Analysis (1.2–1.3)</w:t>
+      </w:r>
+    </w:p>
+    <w:p>
+      <w:pPr>
+        <w:numPr>
+          <w:ilvl w:val="0"/>
+          <w:numId w:val="21"/>
+        </w:numPr>
+        <w:spacing w:lineRule="auto"/>
+      </w:pPr>
+      <w:r>
+        <w:rPr/>
+        <w:t xml:space="preserve">Risk Assessment (1.4)</w:t>
+      </w:r>
+    </w:p>
+    <w:p>
+      <w:pPr>
+        <w:numPr>
+          <w:ilvl w:val="0"/>
+          <w:numId w:val="21"/>
+        </w:numPr>
+        <w:spacing w:lineRule="auto"/>
+      </w:pPr>
+      <w:r>
+        <w:rPr/>
+        <w:t xml:space="preserve">Methodology — discovery, testing, investigation, your logging setup, and </w:t>
+      </w:r>
+      <w:r>
+        <w:rPr>
+          <w:b/>
+        </w:rPr>
+        <w:t xml:space="preserve">whether you used the manual path or Wazuh</w:t>
+      </w:r>
+      <w:r>
+        <w:rPr/>
+        <w:t xml:space="preserve"> (1.5, plus your research log)</w:t>
+      </w:r>
+    </w:p>
+    <w:p>
+      <w:pPr>
+        <w:numPr>
+          <w:ilvl w:val="0"/>
+          <w:numId w:val="21"/>
+        </w:numPr>
+        <w:spacing w:lineRule="auto"/>
+      </w:pPr>
+      <w:r>
+        <w:rPr/>
+        <w:t xml:space="preserve">Attack Simulation Findings — the Attack Log for 2.3–2.8</w:t>
+      </w:r>
+    </w:p>
+    <w:p>
+      <w:pPr>
+        <w:numPr>
+          <w:ilvl w:val="0"/>
+          <w:numId w:val="21"/>
+        </w:numPr>
+        <w:spacing w:lineRule="auto"/>
+      </w:pPr>
+      <w:r>
+        <w:rPr/>
+        <w:t xml:space="preserve">Detection Coverage &amp; Investigation — Task 3.2 notes, </w:t>
+      </w:r>
+      <w:r>
+        <w:rPr>
+          <w:b/>
+        </w:rPr>
+        <w:t xml:space="preserve">the seeded-incident Incident Report (3.3)</w:t>
+      </w:r>
+      <w:r>
+        <w:rPr/>
+        <w:t xml:space="preserve">, detection coverage (3.4)</w:t>
+      </w:r>
+    </w:p>
+    <w:p>
+      <w:pPr>
+        <w:numPr>
+          <w:ilvl w:val="0"/>
+          <w:numId w:val="21"/>
+        </w:numPr>
+        <w:spacing w:lineRule="auto"/>
+      </w:pPr>
+      <w:r>
+        <w:rPr/>
+        <w:t xml:space="preserve">Recommendations (4.1) — each with the technical / compensating / detective levels where they apply</w:t>
+      </w:r>
+    </w:p>
+    <w:p>
+      <w:pPr>
+        <w:numPr>
+          <w:ilvl w:val="0"/>
+          <w:numId w:val="21"/>
+        </w:numPr>
+        <w:spacing w:lineRule="auto"/>
+      </w:pPr>
+      <w:r>
+        <w:rPr/>
+        <w:t xml:space="preserve">Limitations — what this assessment did not cover, and why (4.4)</w:t>
+      </w:r>
+    </w:p>
+    <w:p>
+      <w:pPr>
+        <w:numPr>
+          <w:ilvl w:val="0"/>
+          <w:numId w:val="21"/>
+        </w:numPr>
+        <w:spacing w:lineRule="auto"/>
+      </w:pPr>
+      <w:r>
+        <w:rPr/>
+        <w:t xml:space="preserve">Appendices — raw </w:t>
+      </w:r>
+      <w:r>
+        <w:rPr/>
+        <w:t xml:space="preserve">nmap</w:t>
+      </w:r>
+      <w:r>
+        <w:rPr/>
+        <w:t xml:space="preserve"> output, full log excerpts, extra screenshots, your research log</w:t>
+      </w:r>
+    </w:p>
+    <w:p>
+      <w:pPr>
+        <w:pStyle w:val="Heading2"/>
+        <w:spacing w:lineRule="auto"/>
+      </w:pPr>
+      <w:r>
+        <w:rPr/>
+        <w:t xml:space="preserve">Appendix B — Evidence &amp; Finding Templates</w:t>
+      </w:r>
+    </w:p>
+    <w:p>
+      <w:pPr>
+        <w:spacing w:lineRule="auto"/>
+      </w:pPr>
+      <w:r>
+        <w:rPr>
+          <w:b/>
+        </w:rPr>
+        <w:t xml:space="preserve">Evidence rules:</w:t>
+      </w:r>
+      <w:r>
+        <w:rPr/>
+        <w:t xml:space="preserve"> full window (URL bar / prompt visible), not a crop · descriptive filenames (</w:t>
+      </w:r>
+      <w:r>
+        <w:rPr/>
+        <w:t xml:space="preserve">W2-T2.5-sqli-payload.png</w:t>
+      </w:r>
+      <w:r>
+        <w:rPr/>
+        <w:t xml:space="preserve">) · terminal output saved as text · log excerpts with surrounding context, the key line highlighted · note automatic vs manual for every SIEM finding.</w:t>
+      </w:r>
+    </w:p>
+    <w:p>
+      <w:pPr>
+        <w:spacing w:lineRule="auto"/>
+      </w:pPr>
+      <w:r>
+        <w:rPr>
+          <w:b/>
+        </w:rPr>
+        <w:t xml:space="preserve">File naming:</w:t>
+      </w:r>
+      <w:r>
+        <w:rPr/>
+        <w:t xml:space="preserve">W&lt;week&gt;-T&lt;task&gt;-&lt;description&gt;.&lt;ext&gt;</w:t>
+      </w:r>
+      <w:r>
+        <w:rPr/>
+        <w:t xml:space="preserve"> — e.g. </w:t>
+      </w:r>
+      <w:r>
+        <w:rPr/>
+        <w:t xml:space="preserve">W1-T1.1-network-diagram.png</w:t>
+      </w:r>
+      <w:r>
+        <w:rPr/>
+        <w:t xml:space="preserve">, </w:t>
+      </w:r>
+      <w:r>
+        <w:rPr/>
+        <w:t xml:space="preserve">W2-T2.3-vsftpd-shell.png</w:t>
+      </w:r>
+      <w:r>
+        <w:rPr/>
+        <w:t xml:space="preserve">, </w:t>
+      </w:r>
+      <w:r>
+        <w:rPr/>
+        <w:t xml:space="preserve">W2-T2.5-sqli.png</w:t>
+      </w:r>
+      <w:r>
+        <w:rPr/>
+        <w:t xml:space="preserve">, </w:t>
+      </w:r>
+      <w:r>
+        <w:rPr/>
+        <w:t xml:space="preserve">W3-T3.3-incident-timeline.png</w:t>
+      </w:r>
+      <w:r>
+        <w:rPr/>
+        <w:t xml:space="preserve">.</w:t>
+      </w:r>
+    </w:p>
+    <w:p>
+      <w:pPr>
+        <w:pStyle w:val="Heading3"/>
+        <w:spacing w:lineRule="auto"/>
+      </w:pPr>
+      <w:r>
+        <w:rPr/>
+        <w:t xml:space="preserve">Standard Attack Evidence entry (one per attack)</w:t>
+      </w:r>
+    </w:p>
+    <w:p>
+      <w:pPr>
+        <w:spacing w:lineRule="auto"/>
+      </w:pPr>
+      <w:r>
+        <w:rPr>
+          <w:rFonts w:ascii="Courier" w:hAnsi="Courier"/>
+        </w:rPr>
+        <w:t xml:space="preserve">Attack ID · Target · Source IP · Target IP · Port · Service/App · Attack type · Tool/PoC CVE / CWE (for a service-version exploit like Task 2.3) · CVSS v3.1 vector + score Payload / method · Start time · End time · Result · Evidence (filenames) Log evidence (file + line) · Detection status (Automatic / Manual / Not Visible) Log source · (Wazuh) rule ID + level · Search method / filter Analyst explanation — how the evidence supports the attack </w:t>
+      </w:r>
+    </w:p>
+    <w:p>
+      <w:pPr>
+        <w:pStyle w:val="Heading3"/>
+        <w:spacing w:lineRule="auto"/>
+      </w:pPr>
+      <w:r>
+        <w:rPr/>
+        <w:t xml:space="preserve">Standard Finding entry (one per weakness)</w:t>
+      </w:r>
+    </w:p>
+    <w:p>
+      <w:pPr>
+        <w:spacing w:lineRule="auto"/>
+      </w:pPr>
+      <w:r>
+        <w:rPr>
+          <w:rFonts w:ascii="Courier" w:hAnsi="Courier"/>
+        </w:rPr>
+        <w:t xml:space="preserve">Title (e.g. "Weak SSH authentication") · Affected asset · Affected service Evidence (screenshot / log ref) · Attack demonstrated CWE  — the weakness class. e.g. CWE-89 SQL injection · CWE-79 XSS · CWE-78 OS command        injection · CWE-307 improper restriction of excessive auth attempts CVE  — the specific CVE, when the finding is a known flaw in a service version        (e.g. vsftpd 2.3.4 backdoor = CVE-2011-2523). For a DVWA application-logic finding        there is usually no CVE — write "N/A — application-logic flaw, see CWE". CVSS — v3.1 base vector string + score + one line justifying the metrics you chose        (e.g. AV:N/AC:L/PR:N/UI:N/S:U/C:H/I:H/A:H = 9.8 Critical) Impact — what could happen to SecureCorp if exploited Risk rating — Low / Moderate / High / Critical Detection — how it appeared (alert / manual / not visible) Remediation:   technical fix        — patch / validate input / disable the service   compensating control — WAF, rate limiting, segmentation, MFA (when the fix can't ship now)   detective control    — the log source or Wazuh rule that catches it if it recurs </w:t>
+      </w:r>
+    </w:p>
+    <w:p>
+      <w:pPr>
+        <w:pStyle w:val="Heading3"/>
+        <w:spacing w:lineRule="auto"/>
+      </w:pPr>
+      <w:r>
+        <w:rPr/>
+        <w:t xml:space="preserve">Incident Report (Task 3.3)</w:t>
+      </w:r>
+    </w:p>
+    <w:p>
+      <w:pPr>
+        <w:spacing w:lineRule="auto"/>
+      </w:pPr>
+      <w:r>
+        <w:rPr>
+          <w:rFonts w:ascii="Courier" w:hAnsi="Courier"/>
+        </w:rPr>
+        <w:t xml:space="preserve">Summary (3–4 sentences a manager understands) Timeline:   Time | Event | Source (log) | Evidence / notes IOCs: source IP(s) · filenames · persistence path · C2 / exfil host Which events were MINE (Week 2) vs NOT — and how I told them apart Classification (event / alert / incident) — with the evidence Confirmed impact: successful access? persistence installed? data taken? Immediate recommended actions </w:t>
+      </w:r>
+    </w:p>
+    <w:p>
+      <w:pPr>
+        <w:pStyle w:val="Heading2"/>
+        <w:spacing w:lineRule="auto"/>
+      </w:pPr>
+      <w:r>
+        <w:rPr/>
+        <w:t xml:space="preserve">Appendix C — Marking Rubric (mapped to deliverables)</w:t>
+      </w:r>
+    </w:p>
+    <w:p>
+      <w:pPr>
+        <w:spacing w:lineRule="auto"/>
+      </w:pPr>
+      <w:r>
+        <w:rPr>
+          <w:b/>
+        </w:rPr>
+        <w:t xml:space="preserve">Total: 100 marks.</w:t>
       </w:r>
     </w:p>
     <w:tbl>
@@ -7717,538 +8807,6 @@
             </w:pPr>
             <w:r>
               <w:rPr/>
-              <w:t xml:space="preserve">Area</w:t>
-            </w:r>
-          </w:p>
-        </w:tc>
-        <w:tc>
-          <w:tcPr>
-            <w:tcBorders>
-              <w:top w:val="single" w:sz="1" w:space="0" w:color="000000"/>
-              <w:bottom w:val="single" w:sz="1" w:space="0" w:color="000000"/>
-              <w:left w:val="single" w:sz="1" w:space="0" w:color="000000"/>
-              <w:right w:val="single" w:sz="1" w:space="0" w:color="000000"/>
-            </w:tcBorders>
-          </w:tcPr>
-          <w:p>
-            <w:pPr>
-              <w:spacing w:lineRule="auto"/>
-            </w:pPr>
-            <w:r>
-              <w:rPr/>
-              <w:t xml:space="preserve">Current state (evidence)</w:t>
-            </w:r>
-          </w:p>
-        </w:tc>
-        <w:tc>
-          <w:tcPr>
-            <w:tcBorders>
-              <w:top w:val="single" w:sz="1" w:space="0" w:color="000000"/>
-              <w:bottom w:val="single" w:sz="1" w:space="0" w:color="000000"/>
-              <w:left w:val="single" w:sz="1" w:space="0" w:color="000000"/>
-              <w:right w:val="single" w:sz="1" w:space="0" w:color="000000"/>
-            </w:tcBorders>
-          </w:tcPr>
-          <w:p>
-            <w:pPr>
-              <w:spacing w:lineRule="auto"/>
-            </w:pPr>
-            <w:r>
-              <w:rPr/>
-              <w:t xml:space="preserve">Recommendation</w:t>
-            </w:r>
-          </w:p>
-        </w:tc>
-        <w:tc>
-          <w:tcPr>
-            <w:tcBorders>
-              <w:top w:val="single" w:sz="1" w:space="0" w:color="000000"/>
-              <w:bottom w:val="single" w:sz="1" w:space="0" w:color="000000"/>
-              <w:left w:val="single" w:sz="1" w:space="0" w:color="000000"/>
-              <w:right w:val="single" w:sz="1" w:space="0" w:color="000000"/>
-            </w:tcBorders>
-          </w:tcPr>
-          <w:p>
-            <w:pPr>
-              <w:spacing w:lineRule="auto"/>
-            </w:pPr>
-            <w:r>
-              <w:rPr/>
-              <w:t xml:space="preserve">Priority</w:t>
-            </w:r>
-          </w:p>
-        </w:tc>
-      </w:tr>
-    </w:tbl>
-    <w:p>
-      <w:pPr>
-        <w:spacing w:lineRule="auto"/>
-      </w:pPr>
-      <w:r>
-        <w:rPr/>
-      </w:r>
-    </w:p>
-    <w:p>
-      <w:pPr>
-        <w:pStyle w:val="Heading3"/>
-        <w:spacing w:lineRule="auto"/>
-      </w:pPr>
-      <w:r>
-        <w:rPr/>
-        <w:t xml:space="preserve">Task 4.2 — Executive Summary</w:t>
-      </w:r>
-    </w:p>
-    <w:p>
-      <w:pPr>
-        <w:spacing w:lineRule="auto"/>
-      </w:pPr>
-      <w:r>
-        <w:rPr>
-          <w:b/>
-        </w:rPr>
-        <w:t xml:space="preserve">Tasks:</w:t>
-      </w:r>
-      <w:r>
-        <w:rPr/>
-        <w:t xml:space="preserve"> one page — overall posture, the most critical findings, the highest business risks, your top recommendations. </w:t>
-      </w:r>
-      <w:r>
-        <w:rPr>
-          <w:b/>
-        </w:rPr>
-        <w:t xml:space="preserve">A non-technical manager must understand it</w:t>
-      </w:r>
-      <w:r>
-        <w:rPr/>
-        <w:t xml:space="preserve"> with none of the Week 2–3 detail. Do </w:t>
-      </w:r>
-      <w:r>
-        <w:rPr>
-          <w:b/>
-        </w:rPr>
-        <w:t xml:space="preserve">not</w:t>
-      </w:r>
-      <w:r>
-        <w:rPr/>
-        <w:t xml:space="preserve"> write it in the same technical language as the rest of the report.</w:t>
-      </w:r>
-    </w:p>
-    <w:p>
-      <w:pPr>
-        <w:pStyle w:val="Heading3"/>
-        <w:spacing w:lineRule="auto"/>
-      </w:pPr>
-      <w:r>
-        <w:rPr/>
-        <w:t xml:space="preserve">Task 4.3 — Final client debrief</w:t>
-      </w:r>
-    </w:p>
-    <w:p>
-      <w:pPr>
-        <w:spacing w:lineRule="auto"/>
-      </w:pPr>
-      <w:r>
-        <w:rPr>
-          <w:b/>
-        </w:rPr>
-        <w:t xml:space="preserve">Tasks:</w:t>
-      </w:r>
-      <w:r>
-        <w:rPr/>
-        <w:t xml:space="preserve"> a 10–15 minute presentation — posture, key findings, evidence (a live demo is optional), recommendations, lessons learned. Be ready for follow-up questions from “SecureCorp leadership” (your instructor / peers).</w:t>
-      </w:r>
-    </w:p>
-    <w:p>
-      <w:pPr>
-        <w:spacing w:lineRule="auto"/>
-      </w:pPr>
-      <w:r>
-        <w:rPr>
-          <w:b/>
-        </w:rPr>
-        <w:t xml:space="preserve">Expected Output:</w:t>
-      </w:r>
-      <w:r>
-        <w:rPr/>
-        <w:t xml:space="preserve"> a slide deck + the delivered presentation.</w:t>
-      </w:r>
-    </w:p>
-    <w:p>
-      <w:pPr>
-        <w:pStyle w:val="Heading2"/>
-        <w:spacing w:lineRule="auto"/>
-      </w:pPr>
-      <w:r>
-        <w:rPr/>
-        <w:t xml:space="preserve">Appendix A — Master Report Template</w:t>
-      </w:r>
-    </w:p>
-    <w:p>
-      <w:pPr>
-        <w:numPr>
-          <w:ilvl w:val="0"/>
-          <w:numId w:val="18"/>
-        </w:numPr>
-        <w:spacing w:lineRule="auto"/>
-      </w:pPr>
-      <w:r>
-        <w:rPr/>
-        <w:t xml:space="preserve">Cover page — engagement title, your name, date</w:t>
-      </w:r>
-    </w:p>
-    <w:p>
-      <w:pPr>
-        <w:numPr>
-          <w:ilvl w:val="0"/>
-          <w:numId w:val="18"/>
-        </w:numPr>
-        <w:spacing w:lineRule="auto"/>
-      </w:pPr>
-      <w:r>
-        <w:rPr/>
-        <w:t xml:space="preserve">Executive Summary (4.2)</w:t>
-      </w:r>
-    </w:p>
-    <w:p>
-      <w:pPr>
-        <w:numPr>
-          <w:ilvl w:val="0"/>
-          <w:numId w:val="18"/>
-        </w:numPr>
-        <w:spacing w:lineRule="auto"/>
-      </w:pPr>
-      <w:r>
-        <w:rPr/>
-        <w:t xml:space="preserve">Scope &amp; Rules of Engagement (§4)</w:t>
-      </w:r>
-    </w:p>
-    <w:p>
-      <w:pPr>
-        <w:numPr>
-          <w:ilvl w:val="0"/>
-          <w:numId w:val="18"/>
-        </w:numPr>
-        <w:spacing w:lineRule="auto"/>
-      </w:pPr>
-      <w:r>
-        <w:rPr/>
-        <w:t xml:space="preserve">Asset Inventory &amp; CIA Analysis (1.2–1.3)</w:t>
-      </w:r>
-    </w:p>
-    <w:p>
-      <w:pPr>
-        <w:numPr>
-          <w:ilvl w:val="0"/>
-          <w:numId w:val="18"/>
-        </w:numPr>
-        <w:spacing w:lineRule="auto"/>
-      </w:pPr>
-      <w:r>
-        <w:rPr/>
-        <w:t xml:space="preserve">Risk Assessment (1.4)</w:t>
-      </w:r>
-    </w:p>
-    <w:p>
-      <w:pPr>
-        <w:numPr>
-          <w:ilvl w:val="0"/>
-          <w:numId w:val="18"/>
-        </w:numPr>
-        <w:spacing w:lineRule="auto"/>
-      </w:pPr>
-      <w:r>
-        <w:rPr/>
-        <w:t xml:space="preserve">Methodology — discovery, testing, investigation, your logging setup, and </w:t>
-      </w:r>
-      <w:r>
-        <w:rPr>
-          <w:b/>
-        </w:rPr>
-        <w:t xml:space="preserve">whether you used the manual path or Wazuh</w:t>
-      </w:r>
-      <w:r>
-        <w:rPr/>
-        <w:t xml:space="preserve"> (1.5, plus your research log)</w:t>
-      </w:r>
-    </w:p>
-    <w:p>
-      <w:pPr>
-        <w:numPr>
-          <w:ilvl w:val="0"/>
-          <w:numId w:val="18"/>
-        </w:numPr>
-        <w:spacing w:lineRule="auto"/>
-      </w:pPr>
-      <w:r>
-        <w:rPr/>
-        <w:t xml:space="preserve">Attack Simulation Findings — the Attack Log for 2.3–2.8</w:t>
-      </w:r>
-    </w:p>
-    <w:p>
-      <w:pPr>
-        <w:numPr>
-          <w:ilvl w:val="0"/>
-          <w:numId w:val="18"/>
-        </w:numPr>
-        <w:spacing w:lineRule="auto"/>
-      </w:pPr>
-      <w:r>
-        <w:rPr/>
-        <w:t xml:space="preserve">Detection Coverage &amp; Investigation — Task 3.2 notes, </w:t>
-      </w:r>
-      <w:r>
-        <w:rPr>
-          <w:b/>
-        </w:rPr>
-        <w:t xml:space="preserve">the seeded-incident Incident Report (3.3)</w:t>
-      </w:r>
-      <w:r>
-        <w:rPr/>
-        <w:t xml:space="preserve">, detection coverage (3.4)</w:t>
-      </w:r>
-    </w:p>
-    <w:p>
-      <w:pPr>
-        <w:numPr>
-          <w:ilvl w:val="0"/>
-          <w:numId w:val="18"/>
-        </w:numPr>
-        <w:spacing w:lineRule="auto"/>
-      </w:pPr>
-      <w:r>
-        <w:rPr/>
-        <w:t xml:space="preserve">Recommendations (4.1)</w:t>
-      </w:r>
-    </w:p>
-    <w:p>
-      <w:pPr>
-        <w:numPr>
-          <w:ilvl w:val="0"/>
-          <w:numId w:val="18"/>
-        </w:numPr>
-        <w:spacing w:lineRule="auto"/>
-      </w:pPr>
-      <w:r>
-        <w:rPr/>
-        <w:t xml:space="preserve">Appendices — raw </w:t>
-      </w:r>
-      <w:r>
-        <w:rPr/>
-        <w:t xml:space="preserve">nmap</w:t>
-      </w:r>
-      <w:r>
-        <w:rPr/>
-        <w:t xml:space="preserve"> output, full log excerpts, extra screenshots, your research log</w:t>
-      </w:r>
-    </w:p>
-    <w:p>
-      <w:pPr>
-        <w:pStyle w:val="Heading2"/>
-        <w:spacing w:lineRule="auto"/>
-      </w:pPr>
-      <w:r>
-        <w:rPr/>
-        <w:t xml:space="preserve">Appendix B — Evidence &amp; Finding Templates</w:t>
-      </w:r>
-    </w:p>
-    <w:p>
-      <w:pPr>
-        <w:spacing w:lineRule="auto"/>
-      </w:pPr>
-      <w:r>
-        <w:rPr>
-          <w:b/>
-        </w:rPr>
-        <w:t xml:space="preserve">Evidence rules:</w:t>
-      </w:r>
-      <w:r>
-        <w:rPr/>
-        <w:t xml:space="preserve"> full window (URL bar / prompt visible), not a crop · descriptive filenames (</w:t>
-      </w:r>
-      <w:r>
-        <w:rPr/>
-        <w:t xml:space="preserve">W2-T2.5-sqli-payload.png</w:t>
-      </w:r>
-      <w:r>
-        <w:rPr/>
-        <w:t xml:space="preserve">) · terminal output saved as text · log excerpts with surrounding context, the key line highlighted · note automatic vs manual for every SIEM finding.</w:t>
-      </w:r>
-    </w:p>
-    <w:p>
-      <w:pPr>
-        <w:spacing w:lineRule="auto"/>
-      </w:pPr>
-      <w:r>
-        <w:rPr>
-          <w:b/>
-        </w:rPr>
-        <w:t xml:space="preserve">File naming:</w:t>
-      </w:r>
-      <w:r>
-        <w:rPr/>
-        <w:t xml:space="preserve">W&lt;week&gt;-T&lt;task&gt;-&lt;description&gt;.&lt;ext&gt;</w:t>
-      </w:r>
-      <w:r>
-        <w:rPr/>
-        <w:t xml:space="preserve"> — e.g. </w:t>
-      </w:r>
-      <w:r>
-        <w:rPr/>
-        <w:t xml:space="preserve">W1-T1.1-network-diagram.png</w:t>
-      </w:r>
-      <w:r>
-        <w:rPr/>
-        <w:t xml:space="preserve">, </w:t>
-      </w:r>
-      <w:r>
-        <w:rPr/>
-        <w:t xml:space="preserve">W2-T2.3-vsftpd-shell.png</w:t>
-      </w:r>
-      <w:r>
-        <w:rPr/>
-        <w:t xml:space="preserve">, </w:t>
-      </w:r>
-      <w:r>
-        <w:rPr/>
-        <w:t xml:space="preserve">W2-T2.5-sqli.png</w:t>
-      </w:r>
-      <w:r>
-        <w:rPr/>
-        <w:t xml:space="preserve">, </w:t>
-      </w:r>
-      <w:r>
-        <w:rPr/>
-        <w:t xml:space="preserve">W3-T3.3-incident-timeline.png</w:t>
-      </w:r>
-      <w:r>
-        <w:rPr/>
-        <w:t xml:space="preserve">.</w:t>
-      </w:r>
-    </w:p>
-    <w:p>
-      <w:pPr>
-        <w:pStyle w:val="Heading3"/>
-        <w:spacing w:lineRule="auto"/>
-      </w:pPr>
-      <w:r>
-        <w:rPr/>
-        <w:t xml:space="preserve">Standard Attack Evidence entry (one per attack)</w:t>
-      </w:r>
-    </w:p>
-    <w:p>
-      <w:pPr>
-        <w:spacing w:lineRule="auto"/>
-      </w:pPr>
-      <w:r>
-        <w:rPr>
-          <w:rFonts w:ascii="Courier" w:hAnsi="Courier"/>
-        </w:rPr>
-        <w:t xml:space="preserve">Attack ID · Target · Source IP · Target IP · Port · Service/App · Attack type · Tool/PoC Payload / method · Start time · End time · Result · Evidence (filenames) Log evidence (file + line) · Detection status (Automatic / Manual / Not Visible) Log source · (Wazuh) rule ID + level · Search method / filter Analyst explanation — how the evidence supports the attack </w:t>
-      </w:r>
-    </w:p>
-    <w:p>
-      <w:pPr>
-        <w:pStyle w:val="Heading3"/>
-        <w:spacing w:lineRule="auto"/>
-      </w:pPr>
-      <w:r>
-        <w:rPr/>
-        <w:t xml:space="preserve">Standard Finding entry (one per weakness)</w:t>
-      </w:r>
-    </w:p>
-    <w:p>
-      <w:pPr>
-        <w:spacing w:lineRule="auto"/>
-      </w:pPr>
-      <w:r>
-        <w:rPr>
-          <w:rFonts w:ascii="Courier" w:hAnsi="Courier"/>
-        </w:rPr>
-        <w:t xml:space="preserve">Title (e.g. "Weak SSH authentication") · Affected asset · Affected service Evidence (screenshot / log ref) · Attack demonstrated Impact — what could happen to SecureCorp if exploited Risk rating — Low / Moderate / High / Critical Detection — how it appeared (alert / manual / not visible) Recommendation — the control that fixes it </w:t>
-      </w:r>
-    </w:p>
-    <w:p>
-      <w:pPr>
-        <w:pStyle w:val="Heading3"/>
-        <w:spacing w:lineRule="auto"/>
-      </w:pPr>
-      <w:r>
-        <w:rPr/>
-        <w:t xml:space="preserve">Incident Report (Task 3.3)</w:t>
-      </w:r>
-    </w:p>
-    <w:p>
-      <w:pPr>
-        <w:spacing w:lineRule="auto"/>
-      </w:pPr>
-      <w:r>
-        <w:rPr>
-          <w:rFonts w:ascii="Courier" w:hAnsi="Courier"/>
-        </w:rPr>
-        <w:t xml:space="preserve">Summary (3–4 sentences a manager understands) Timeline:   Time | Event | Source (log) | Evidence / notes IOCs: source IP(s) · filenames · persistence path · C2 / exfil host Which events were MINE (Week 2) vs NOT — and how I told them apart Classification (event / alert / incident) — with the evidence Confirmed impact: successful access? persistence installed? data taken? Immediate recommended actions </w:t>
-      </w:r>
-    </w:p>
-    <w:p>
-      <w:pPr>
-        <w:pStyle w:val="Heading2"/>
-        <w:spacing w:lineRule="auto"/>
-      </w:pPr>
-      <w:r>
-        <w:rPr/>
-        <w:t xml:space="preserve">Appendix C — Marking Rubric (mapped to deliverables)</w:t>
-      </w:r>
-    </w:p>
-    <w:p>
-      <w:pPr>
-        <w:spacing w:lineRule="auto"/>
-      </w:pPr>
-      <w:r>
-        <w:rPr>
-          <w:b/>
-        </w:rPr>
-        <w:t xml:space="preserve">Total: 100 marks.</w:t>
-      </w:r>
-    </w:p>
-    <w:tbl>
-      <w:tblPr>
-        <w:tblBorders>
-          <w:top w:val="single" w:sz="2" w:space="0" w:color="000000"/>
-          <w:bottom w:val="single" w:sz="2" w:space="0" w:color="000000"/>
-          <w:left w:val="single" w:sz="2" w:space="0" w:color="000000"/>
-          <w:right w:val="single" w:sz="2" w:space="0" w:color="000000"/>
-        </w:tblBorders>
-        <w:tblCellSpacing w:w="0" w:type="dxa"/>
-        <w:tblCellMar>
-          <w:top w:type="dxa" w:w="80"/>
-          <w:bottom w:type="dxa" w:w="80"/>
-          <w:left w:type="dxa" w:w="160"/>
-          <w:right w:type="dxa" w:w="160"/>
-        </w:tblCellMar>
-        <w:jc w:val="center"/>
-      </w:tblPr>
-      <w:tblGrid>
-        <w:gridCol w:w="2160"/>
-        <w:gridCol w:w="2160"/>
-        <w:gridCol w:w="2160"/>
-        <w:gridCol w:w="2160"/>
-      </w:tblGrid>
-      <w:tr>
-        <w:trPr/>
-        <w:tc>
-          <w:tcPr>
-            <w:tcBorders>
-              <w:top w:val="single" w:sz="1" w:space="0" w:color="000000"/>
-              <w:bottom w:val="single" w:sz="1" w:space="0" w:color="000000"/>
-              <w:left w:val="single" w:sz="1" w:space="0" w:color="000000"/>
-              <w:right w:val="single" w:sz="1" w:space="0" w:color="000000"/>
-            </w:tcBorders>
-          </w:tcPr>
-          <w:p>
-            <w:pPr>
-              <w:spacing w:lineRule="auto"/>
-            </w:pPr>
-            <w:r>
-              <w:rPr/>
               <w:t xml:space="preserve">#</w:t>
             </w:r>
           </w:p>
@@ -8699,7 +9257,7 @@
             </w:pPr>
             <w:r>
               <w:rPr/>
-              <w:t xml:space="preserve">2.3 (shell + proof; +Challenge: priv-esc / cracked hash)</w:t>
+              <w:t xml:space="preserve">2.3 (shell + proof; +Challenge: priv-esc / cracked hash / kill-chain write-up)</w:t>
             </w:r>
           </w:p>
         </w:tc>
@@ -9017,7 +9575,7 @@
             </w:pPr>
             <w:r>
               <w:rPr/>
-              <w:t xml:space="preserve">3.4 (+Challenge: Wazuh comparison; +Stretch: custom rule)</w:t>
+              <w:t xml:space="preserve">3.4 (+Challenge: Wazuh comparison; +Stretch: a custom rule per Manual/Not-Visible activity)</w:t>
             </w:r>
           </w:p>
         </w:tc>
@@ -9096,7 +9654,7 @@
             </w:pPr>
             <w:r>
               <w:rPr/>
-              <w:t xml:space="preserve">4.1 — tied to findings, prioritized</w:t>
+              <w:t xml:space="preserve">4.1 — tied to findings, prioritized, with technical / compensating / detective controls</w:t>
             </w:r>
           </w:p>
         </w:tc>
@@ -9156,26 +9714,26 @@
             </w:pPr>
             <w:r>
               <w:rPr/>
-              <w:t xml:space="preserve">Report quality &amp; Executive Summary</w:t>
-            </w:r>
-          </w:p>
-        </w:tc>
-        <w:tc>
-          <w:tcPr>
-            <w:tcBorders>
-              <w:top w:val="single" w:sz="1" w:space="0" w:color="000000"/>
-              <w:bottom w:val="single" w:sz="1" w:space="0" w:color="000000"/>
-              <w:left w:val="single" w:sz="1" w:space="0" w:color="000000"/>
-              <w:right w:val="single" w:sz="1" w:space="0" w:color="000000"/>
-            </w:tcBorders>
-          </w:tcPr>
-          <w:p>
-            <w:pPr>
-              <w:spacing w:lineRule="auto"/>
-            </w:pPr>
-            <w:r>
-              <w:rPr/>
-              <w:t xml:space="preserve">Appendix A structure; 4.2 written for a non-technical reader</w:t>
+              <w:t xml:space="preserve">Report quality, Limitations &amp; Executive Summary</w:t>
+            </w:r>
+          </w:p>
+        </w:tc>
+        <w:tc>
+          <w:tcPr>
+            <w:tcBorders>
+              <w:top w:val="single" w:sz="1" w:space="0" w:color="000000"/>
+              <w:bottom w:val="single" w:sz="1" w:space="0" w:color="000000"/>
+              <w:left w:val="single" w:sz="1" w:space="0" w:color="000000"/>
+              <w:right w:val="single" w:sz="1" w:space="0" w:color="000000"/>
+            </w:tcBorders>
+          </w:tcPr>
+          <w:p>
+            <w:pPr>
+              <w:spacing w:lineRule="auto"/>
+            </w:pPr>
+            <w:r>
+              <w:rPr/>
+              <w:t xml:space="preserve">Appendix A structure; §10 Limitations (4.4); 4.2 for a non-technical reader</w:t>
             </w:r>
           </w:p>
         </w:tc>
@@ -9274,6 +9832,168 @@
             <w:r>
               <w:rPr/>
               <w:t xml:space="preserve">6</w:t>
+            </w:r>
+          </w:p>
+        </w:tc>
+      </w:tr>
+      <w:tr>
+        <w:trPr/>
+        <w:tc>
+          <w:tcPr>
+            <w:tcBorders>
+              <w:top w:val="single" w:sz="1" w:space="0" w:color="000000"/>
+              <w:bottom w:val="single" w:sz="1" w:space="0" w:color="000000"/>
+              <w:left w:val="single" w:sz="1" w:space="0" w:color="000000"/>
+              <w:right w:val="single" w:sz="1" w:space="0" w:color="000000"/>
+            </w:tcBorders>
+          </w:tcPr>
+          <w:p>
+            <w:pPr>
+              <w:spacing w:lineRule="auto"/>
+            </w:pPr>
+            <w:r>
+              <w:rPr/>
+              <w:t xml:space="preserve">—</w:t>
+            </w:r>
+          </w:p>
+        </w:tc>
+        <w:tc>
+          <w:tcPr>
+            <w:tcBorders>
+              <w:top w:val="single" w:sz="1" w:space="0" w:color="000000"/>
+              <w:bottom w:val="single" w:sz="1" w:space="0" w:color="000000"/>
+              <w:left w:val="single" w:sz="1" w:space="0" w:color="000000"/>
+              <w:right w:val="single" w:sz="1" w:space="0" w:color="000000"/>
+            </w:tcBorders>
+          </w:tcPr>
+          <w:p>
+            <w:pPr>
+              <w:spacing w:lineRule="auto"/>
+            </w:pPr>
+            <w:r>
+              <w:rPr>
+                <w:b/>
+              </w:rPr>
+              <w:t xml:space="preserve">Findings quality</w:t>
+            </w:r>
+          </w:p>
+        </w:tc>
+        <w:tc>
+          <w:tcPr>
+            <w:tcBorders>
+              <w:top w:val="single" w:sz="1" w:space="0" w:color="000000"/>
+              <w:bottom w:val="single" w:sz="1" w:space="0" w:color="000000"/>
+              <w:left w:val="single" w:sz="1" w:space="0" w:color="000000"/>
+              <w:right w:val="single" w:sz="1" w:space="0" w:color="000000"/>
+            </w:tcBorders>
+          </w:tcPr>
+          <w:p>
+            <w:pPr>
+              <w:spacing w:lineRule="auto"/>
+            </w:pPr>
+            <w:r>
+              <w:rPr/>
+              <w:t xml:space="preserve">CWE + CVSS v3.1 on every finding; CVE where one applies</w:t>
+            </w:r>
+          </w:p>
+        </w:tc>
+        <w:tc>
+          <w:tcPr>
+            <w:tcBorders>
+              <w:top w:val="single" w:sz="1" w:space="0" w:color="000000"/>
+              <w:bottom w:val="single" w:sz="1" w:space="0" w:color="000000"/>
+              <w:left w:val="single" w:sz="1" w:space="0" w:color="000000"/>
+              <w:right w:val="single" w:sz="1" w:space="0" w:color="000000"/>
+            </w:tcBorders>
+          </w:tcPr>
+          <w:p>
+            <w:pPr>
+              <w:spacing w:lineRule="auto"/>
+            </w:pPr>
+            <w:r>
+              <w:rPr/>
+              <w:t xml:space="preserve">(folded into 5, 6, 10)</w:t>
+            </w:r>
+          </w:p>
+        </w:tc>
+      </w:tr>
+      <w:tr>
+        <w:trPr/>
+        <w:tc>
+          <w:tcPr>
+            <w:tcBorders>
+              <w:top w:val="single" w:sz="1" w:space="0" w:color="000000"/>
+              <w:bottom w:val="single" w:sz="1" w:space="0" w:color="000000"/>
+              <w:left w:val="single" w:sz="1" w:space="0" w:color="000000"/>
+              <w:right w:val="single" w:sz="1" w:space="0" w:color="000000"/>
+            </w:tcBorders>
+          </w:tcPr>
+          <w:p>
+            <w:pPr>
+              <w:spacing w:lineRule="auto"/>
+            </w:pPr>
+            <w:r>
+              <w:rPr/>
+              <w:t xml:space="preserve">—</w:t>
+            </w:r>
+          </w:p>
+        </w:tc>
+        <w:tc>
+          <w:tcPr>
+            <w:tcBorders>
+              <w:top w:val="single" w:sz="1" w:space="0" w:color="000000"/>
+              <w:bottom w:val="single" w:sz="1" w:space="0" w:color="000000"/>
+              <w:left w:val="single" w:sz="1" w:space="0" w:color="000000"/>
+              <w:right w:val="single" w:sz="1" w:space="0" w:color="000000"/>
+            </w:tcBorders>
+          </w:tcPr>
+          <w:p>
+            <w:pPr>
+              <w:spacing w:lineRule="auto"/>
+            </w:pPr>
+            <w:r>
+              <w:rPr>
+                <w:b/>
+              </w:rPr>
+              <w:t xml:space="preserve">Reflection</w:t>
+            </w:r>
+          </w:p>
+        </w:tc>
+        <w:tc>
+          <w:tcPr>
+            <w:tcBorders>
+              <w:top w:val="single" w:sz="1" w:space="0" w:color="000000"/>
+              <w:bottom w:val="single" w:sz="1" w:space="0" w:color="000000"/>
+              <w:left w:val="single" w:sz="1" w:space="0" w:color="000000"/>
+              <w:right w:val="single" w:sz="1" w:space="0" w:color="000000"/>
+            </w:tcBorders>
+          </w:tcPr>
+          <w:p>
+            <w:pPr>
+              <w:spacing w:lineRule="auto"/>
+            </w:pPr>
+            <w:r>
+              <w:rPr/>
+              <w:t xml:space="preserve">4.4 — one page, the red/blue questions</w:t>
+            </w:r>
+          </w:p>
+        </w:tc>
+        <w:tc>
+          <w:tcPr>
+            <w:tcBorders>
+              <w:top w:val="single" w:sz="1" w:space="0" w:color="000000"/>
+              <w:bottom w:val="single" w:sz="1" w:space="0" w:color="000000"/>
+              <w:left w:val="single" w:sz="1" w:space="0" w:color="000000"/>
+              <w:right w:val="single" w:sz="1" w:space="0" w:color="000000"/>
+            </w:tcBorders>
+          </w:tcPr>
+          <w:p>
+            <w:pPr>
+              <w:spacing w:lineRule="auto"/>
+            </w:pPr>
+            <w:r>
+              <w:rPr/>
+              <w:t xml:space="preserve">(folded into 11)</w:t>
             </w:r>
           </w:p>
         </w:tc>
@@ -9402,7 +10122,7 @@
       <w:pPr>
         <w:numPr>
           <w:ilvl w:val="0"/>
-          <w:numId w:val="19"/>
+          <w:numId w:val="22"/>
         </w:numPr>
         <w:spacing w:lineRule="auto"/>
       </w:pPr>
@@ -9415,7 +10135,7 @@
       <w:pPr>
         <w:numPr>
           <w:ilvl w:val="0"/>
-          <w:numId w:val="19"/>
+          <w:numId w:val="22"/>
         </w:numPr>
         <w:spacing w:lineRule="auto"/>
       </w:pPr>
@@ -9428,118 +10148,156 @@
       <w:pPr>
         <w:numPr>
           <w:ilvl w:val="0"/>
-          <w:numId w:val="19"/>
+          <w:numId w:val="22"/>
         </w:numPr>
         <w:spacing w:lineRule="auto"/>
       </w:pPr>
       <w:r>
         <w:rPr/>
-        <w:t xml:space="preserve">”It’s a risk” with no explanation of the impact.</w:t>
+        <w:t xml:space="preserve">A finding with no </w:t>
+      </w:r>
+      <w:r>
+        <w:rPr>
+          <w:b/>
+        </w:rPr>
+        <w:t xml:space="preserve">CWE</w:t>
+      </w:r>
+      <w:r>
+        <w:rPr/>
+        <w:t xml:space="preserve"> and no </w:t>
+      </w:r>
+      <w:r>
+        <w:rPr>
+          <w:b/>
+        </w:rPr>
+        <w:t xml:space="preserve">CVSS</w:t>
+      </w:r>
+      <w:r>
+        <w:rPr/>
+        <w:t xml:space="preserve"> score — every finding needs both; a </w:t>
+      </w:r>
+      <w:r>
+        <w:rPr>
+          <w:b/>
+        </w:rPr>
+        <w:t xml:space="preserve">CVE</w:t>
+      </w:r>
+      <w:r>
+        <w:rPr/>
+        <w:t xml:space="preserve"> too where the flaw is a known issue in a service version.</w:t>
       </w:r>
     </w:p>
     <w:p>
       <w:pPr>
         <w:numPr>
           <w:ilvl w:val="0"/>
-          <w:numId w:val="19"/>
+          <w:numId w:val="22"/>
         </w:numPr>
         <w:spacing w:lineRule="auto"/>
       </w:pPr>
       <w:r>
         <w:rPr/>
-        <w:t xml:space="preserve">No standard terminology (CVE, CVSS, CIA, IOC) where it belongs.</w:t>
+        <w:t xml:space="preserve">A recommendation with only a technical fix and no </w:t>
+      </w:r>
+      <w:r>
+        <w:rPr>
+          <w:b/>
+        </w:rPr>
+        <w:t xml:space="preserve">detective control</w:t>
+      </w:r>
+      <w:r>
+        <w:rPr/>
+        <w:t xml:space="preserve"> — if it recurs, how would SecureCorp know?</w:t>
       </w:r>
     </w:p>
     <w:p>
       <w:pPr>
         <w:numPr>
           <w:ilvl w:val="0"/>
-          <w:numId w:val="19"/>
+          <w:numId w:val="22"/>
         </w:numPr>
         <w:spacing w:lineRule="auto"/>
       </w:pPr>
       <w:r>
         <w:rPr/>
-        <w:t xml:space="preserve">Findings scattered instead of following Appendix A.</w:t>
+        <w:t xml:space="preserve">”It’s a risk” with no explanation of the impact.</w:t>
       </w:r>
     </w:p>
     <w:p>
       <w:pPr>
         <w:numPr>
           <w:ilvl w:val="0"/>
-          <w:numId w:val="19"/>
+          <w:numId w:val="22"/>
         </w:numPr>
         <w:spacing w:lineRule="auto"/>
       </w:pPr>
       <w:r>
         <w:rPr/>
-        <w:t xml:space="preserve">Treating Week 3 as unrelated to Week 2 — you’re investigating your own attacks </w:t>
-      </w:r>
-      <w:r>
-        <w:rPr/>
-        <w:t xml:space="preserve">plus</w:t>
-      </w:r>
-      <w:r>
-        <w:rPr/>
-        <w:t xml:space="preserve"> the seeded activity.</w:t>
+        <w:t xml:space="preserve">No standard terminology (CVE, CVSS, CWE, CIA, IOC) where it belongs.</w:t>
       </w:r>
     </w:p>
     <w:p>
       <w:pPr>
         <w:numPr>
           <w:ilvl w:val="0"/>
-          <w:numId w:val="19"/>
+          <w:numId w:val="22"/>
         </w:numPr>
         <w:spacing w:lineRule="auto"/>
       </w:pPr>
       <w:r>
-        <w:rPr>
-          <w:b/>
-        </w:rPr>
-        <w:t xml:space="preserve">Not recording timestamps and source IPs in Week 2</w:t>
-      </w:r>
-      <w:r>
-        <w:rPr/>
-        <w:t xml:space="preserve"> — makes Week 3 nearly impossible.</w:t>
+        <w:rPr/>
+        <w:t xml:space="preserve">No </w:t>
+      </w:r>
+      <w:r>
+        <w:rPr>
+          <w:b/>
+        </w:rPr>
+        <w:t xml:space="preserve">Limitations</w:t>
+      </w:r>
+      <w:r>
+        <w:rPr/>
+        <w:t xml:space="preserve"> section — a report that implies you found everything reads as less credible, not more.</w:t>
       </w:r>
     </w:p>
     <w:p>
       <w:pPr>
         <w:numPr>
           <w:ilvl w:val="0"/>
-          <w:numId w:val="19"/>
+          <w:numId w:val="22"/>
         </w:numPr>
         <w:spacing w:lineRule="auto"/>
       </w:pPr>
       <w:r>
-        <w:rPr>
-          <w:b/>
-        </w:rPr>
-        <w:t xml:space="preserve">Not identifying which Week-3 events were yours vs the seeded incident</w:t>
-      </w:r>
-      <w:r>
-        <w:rPr/>
-        <w:t xml:space="preserve"> — that comparison is the point of Task 3.3.</w:t>
+        <w:rPr/>
+        <w:t xml:space="preserve">Findings scattered instead of following Appendix A.</w:t>
       </w:r>
     </w:p>
     <w:p>
       <w:pPr>
         <w:numPr>
           <w:ilvl w:val="0"/>
-          <w:numId w:val="19"/>
+          <w:numId w:val="22"/>
         </w:numPr>
         <w:spacing w:lineRule="auto"/>
       </w:pPr>
       <w:r>
         <w:rPr/>
-        <w:t xml:space="preserve">The Executive Summary written in the same technical language as the report.</w:t>
+        <w:t xml:space="preserve">Treating Week 3 as unrelated to Week 2 — you’re investigating your own attacks </w:t>
+      </w:r>
+      <w:r>
+        <w:rPr/>
+        <w:t xml:space="preserve">plus</w:t>
+      </w:r>
+      <w:r>
+        <w:rPr/>
+        <w:t xml:space="preserve"> the seeded activity.</w:t>
       </w:r>
     </w:p>
     <w:p>
       <w:pPr>
         <w:numPr>
           <w:ilvl w:val="0"/>
-          <w:numId w:val="19"/>
+          <w:numId w:val="22"/>
         </w:numPr>
         <w:spacing w:lineRule="auto"/>
       </w:pPr>
@@ -9547,6 +10305,57 @@
         <w:rPr>
           <w:b/>
         </w:rPr>
+        <w:t xml:space="preserve">Not recording timestamps and source IPs in Week 2</w:t>
+      </w:r>
+      <w:r>
+        <w:rPr/>
+        <w:t xml:space="preserve"> — makes Week 3 nearly impossible.</w:t>
+      </w:r>
+    </w:p>
+    <w:p>
+      <w:pPr>
+        <w:numPr>
+          <w:ilvl w:val="0"/>
+          <w:numId w:val="22"/>
+        </w:numPr>
+        <w:spacing w:lineRule="auto"/>
+      </w:pPr>
+      <w:r>
+        <w:rPr>
+          <w:b/>
+        </w:rPr>
+        <w:t xml:space="preserve">Not identifying which Week-3 events were yours vs the seeded incident</w:t>
+      </w:r>
+      <w:r>
+        <w:rPr/>
+        <w:t xml:space="preserve"> — that comparison is the point of Task 3.3.</w:t>
+      </w:r>
+    </w:p>
+    <w:p>
+      <w:pPr>
+        <w:numPr>
+          <w:ilvl w:val="0"/>
+          <w:numId w:val="22"/>
+        </w:numPr>
+        <w:spacing w:lineRule="auto"/>
+      </w:pPr>
+      <w:r>
+        <w:rPr/>
+        <w:t xml:space="preserve">The Executive Summary written in the same technical language as the report.</w:t>
+      </w:r>
+    </w:p>
+    <w:p>
+      <w:pPr>
+        <w:numPr>
+          <w:ilvl w:val="0"/>
+          <w:numId w:val="22"/>
+        </w:numPr>
+        <w:spacing w:lineRule="auto"/>
+      </w:pPr>
+      <w:r>
+        <w:rPr>
+          <w:b/>
+        </w:rPr>
         <w:t xml:space="preserve">A bridged adapter on the target.</w:t>
       </w:r>
       <w:r>
@@ -9581,7 +10390,7 @@
         <w:rPr>
           <w:rFonts w:ascii="Courier" w:hAnsi="Courier"/>
         </w:rPr>
-        <w:t xml:space="preserve">☐  Network diagram (isolation shown) + application map ☐  Asset Inventory · CIA Analysis · Risk Assessment ☐  Log-box screenshot (auth.log arriving; failed-SSH events)  [+ Wazuh screenshot if Challenge] ☐  Recon output + service inventory ☐  Attack Log for 2.3–2.8 — each with evidence, timestamp, source IP ☐  Task 2.3 real-exploit evidence (shell + proof file) ☐  Detection note + ten analyst answers per Week-2 activity (3.2) ☐  Incident Report for the seeded activity (3.3) — timeline, IOCs, classification,      "mine vs not", actions ☐  Detection coverage notes (3.4) ☐  Security Recommendations (tied to findings) ☐  Executive Summary (one page, non-technical) ☐  Final Presentation ☐  Research log ☐  All evidence files named per Appendix B ☐  Both readiness gates (Week 1, Week 2) recorded as passed </w:t>
+        <w:t xml:space="preserve">☐  Network diagram (isolation shown) + application map ☐  Asset Inventory · CIA Analysis · Risk Assessment ☐  Log-box screenshot (auth.log arriving; failed-SSH events)  [+ Wazuh screenshot if Challenge] ☐  Recon output + service inventory ☐  Attack Log for 2.3–2.8 — each with evidence, timestamp, source IP ☐  Task 2.3 real-exploit evidence (shell + proof file) ☐  Detection note + ten analyst answers per Week-2 activity (3.2) ☐  Incident Report for the seeded activity (3.3) — timeline, IOCs, classification,      "mine vs not", actions ☐  Detection coverage notes (3.4) ☐  Every finding carries CWE + CVSS v3.1 (+ CVE where one applies) ☐  Security Recommendations — tied to findings, with technical / compensating / detective controls ☐  Limitations section in the report (4.4) ☐  One-page reflection — W4-T4.4 (4.4) ☐  Executive Summary (one page, non-technical) ☐  Final Presentation ☐  Research log ☐  All evidence files named per Appendix B ☐  Both readiness gates (Week 1, Week 2) recorded as passed </w:t>
       </w:r>
     </w:p>
     <w:p>
@@ -11596,6 +12405,250 @@
   <w:abstractNum w:abstractNumId="18">
     <w:lvl w:ilvl="0">
       <w:start w:val="1"/>
+      <w:numFmt w:val="bullet"/>
+      <w:lvlText w:val=""/>
+      <w:lvlJc w:val="left"/>
+      <w:pPr>
+        <w:tabs>
+          <w:tab w:val="num" w:pos="720"/>
+        </w:tabs>
+        <w:ind w:left="720" w:hanging="360"/>
+      </w:pPr>
+      <w:rPr>
+        <w:rFonts w:ascii="Symbol" w:hAnsi="Symbol" w:hint="default"/>
+      </w:rPr>
+    </w:lvl>
+    <w:lvl w:ilvl="1">
+      <w:start w:val="1"/>
+      <w:numFmt w:val="bullet"/>
+      <w:lvlText w:val=""/>
+      <w:lvlJc w:val="left"/>
+      <w:pPr>
+        <w:tabs>
+          <w:tab w:val="num" w:pos="1440"/>
+        </w:tabs>
+        <w:ind w:left="1440" w:hanging="360"/>
+      </w:pPr>
+      <w:rPr>
+        <w:rFonts w:ascii="Symbol" w:hAnsi="Symbol" w:hint="default"/>
+      </w:rPr>
+    </w:lvl>
+    <w:lvl w:ilvl="2">
+      <w:start w:val="1"/>
+      <w:numFmt w:val="bullet"/>
+      <w:lvlText w:val=""/>
+      <w:lvlJc w:val="left"/>
+      <w:pPr>
+        <w:tabs>
+          <w:tab w:val="num" w:pos="2160"/>
+        </w:tabs>
+        <w:ind w:left="2160" w:hanging="360"/>
+      </w:pPr>
+      <w:rPr>
+        <w:rFonts w:ascii="Symbol" w:hAnsi="Symbol" w:hint="default"/>
+      </w:rPr>
+    </w:lvl>
+    <w:lvl w:ilvl="3">
+      <w:start w:val="1"/>
+      <w:numFmt w:val="bullet"/>
+      <w:lvlText w:val=""/>
+      <w:lvlJc w:val="left"/>
+      <w:pPr>
+        <w:tabs>
+          <w:tab w:val="num" w:pos="2880"/>
+        </w:tabs>
+        <w:ind w:left="2880" w:hanging="360"/>
+      </w:pPr>
+      <w:rPr>
+        <w:rFonts w:ascii="Symbol" w:hAnsi="Symbol" w:hint="default"/>
+      </w:rPr>
+    </w:lvl>
+    <w:lvl w:ilvl="4">
+      <w:start w:val="1"/>
+      <w:numFmt w:val="bullet"/>
+      <w:lvlText w:val=""/>
+      <w:lvlJc w:val="left"/>
+      <w:pPr>
+        <w:tabs>
+          <w:tab w:val="num" w:pos="3600"/>
+        </w:tabs>
+        <w:ind w:left="3600" w:hanging="360"/>
+      </w:pPr>
+      <w:rPr>
+        <w:rFonts w:ascii="Symbol" w:hAnsi="Symbol" w:hint="default"/>
+      </w:rPr>
+    </w:lvl>
+    <w:lvl w:ilvl="5">
+      <w:start w:val="1"/>
+      <w:numFmt w:val="bullet"/>
+      <w:lvlText w:val=""/>
+      <w:lvlJc w:val="left"/>
+      <w:pPr>
+        <w:tabs>
+          <w:tab w:val="num" w:pos="4320"/>
+        </w:tabs>
+        <w:ind w:left="4320" w:hanging="360"/>
+      </w:pPr>
+      <w:rPr>
+        <w:rFonts w:ascii="Symbol" w:hAnsi="Symbol" w:hint="default"/>
+      </w:rPr>
+    </w:lvl>
+    <w:lvl w:ilvl="6">
+      <w:start w:val="1"/>
+      <w:numFmt w:val="bullet"/>
+      <w:lvlText w:val=""/>
+      <w:lvlJc w:val="left"/>
+      <w:pPr>
+        <w:tabs>
+          <w:tab w:val="num" w:pos="5040"/>
+        </w:tabs>
+        <w:ind w:left="5040" w:hanging="360"/>
+      </w:pPr>
+      <w:rPr>
+        <w:rFonts w:ascii="Symbol" w:hAnsi="Symbol" w:hint="default"/>
+      </w:rPr>
+    </w:lvl>
+    <w:lvl w:ilvl="7">
+      <w:start w:val="1"/>
+      <w:numFmt w:val="bullet"/>
+      <w:lvlText w:val=""/>
+      <w:lvlJc w:val="left"/>
+      <w:pPr>
+        <w:tabs>
+          <w:tab w:val="num" w:pos="5760"/>
+        </w:tabs>
+        <w:ind w:left="5760" w:hanging="360"/>
+      </w:pPr>
+      <w:rPr>
+        <w:rFonts w:ascii="Symbol" w:hAnsi="Symbol" w:hint="default"/>
+      </w:rPr>
+    </w:lvl>
+  </w:abstractNum>
+  <w:abstractNum w:abstractNumId="19">
+    <w:lvl w:ilvl="0">
+      <w:start w:val="1"/>
+      <w:numFmt w:val="bullet"/>
+      <w:lvlText w:val=""/>
+      <w:lvlJc w:val="left"/>
+      <w:pPr>
+        <w:tabs>
+          <w:tab w:val="num" w:pos="720"/>
+        </w:tabs>
+        <w:ind w:left="720" w:hanging="360"/>
+      </w:pPr>
+      <w:rPr>
+        <w:rFonts w:ascii="Symbol" w:hAnsi="Symbol" w:hint="default"/>
+      </w:rPr>
+    </w:lvl>
+    <w:lvl w:ilvl="1">
+      <w:start w:val="1"/>
+      <w:numFmt w:val="bullet"/>
+      <w:lvlText w:val=""/>
+      <w:lvlJc w:val="left"/>
+      <w:pPr>
+        <w:tabs>
+          <w:tab w:val="num" w:pos="1440"/>
+        </w:tabs>
+        <w:ind w:left="1440" w:hanging="360"/>
+      </w:pPr>
+      <w:rPr>
+        <w:rFonts w:ascii="Symbol" w:hAnsi="Symbol" w:hint="default"/>
+      </w:rPr>
+    </w:lvl>
+    <w:lvl w:ilvl="2">
+      <w:start w:val="1"/>
+      <w:numFmt w:val="bullet"/>
+      <w:lvlText w:val=""/>
+      <w:lvlJc w:val="left"/>
+      <w:pPr>
+        <w:tabs>
+          <w:tab w:val="num" w:pos="2160"/>
+        </w:tabs>
+        <w:ind w:left="2160" w:hanging="360"/>
+      </w:pPr>
+      <w:rPr>
+        <w:rFonts w:ascii="Symbol" w:hAnsi="Symbol" w:hint="default"/>
+      </w:rPr>
+    </w:lvl>
+    <w:lvl w:ilvl="3">
+      <w:start w:val="1"/>
+      <w:numFmt w:val="bullet"/>
+      <w:lvlText w:val=""/>
+      <w:lvlJc w:val="left"/>
+      <w:pPr>
+        <w:tabs>
+          <w:tab w:val="num" w:pos="2880"/>
+        </w:tabs>
+        <w:ind w:left="2880" w:hanging="360"/>
+      </w:pPr>
+      <w:rPr>
+        <w:rFonts w:ascii="Symbol" w:hAnsi="Symbol" w:hint="default"/>
+      </w:rPr>
+    </w:lvl>
+    <w:lvl w:ilvl="4">
+      <w:start w:val="1"/>
+      <w:numFmt w:val="bullet"/>
+      <w:lvlText w:val=""/>
+      <w:lvlJc w:val="left"/>
+      <w:pPr>
+        <w:tabs>
+          <w:tab w:val="num" w:pos="3600"/>
+        </w:tabs>
+        <w:ind w:left="3600" w:hanging="360"/>
+      </w:pPr>
+      <w:rPr>
+        <w:rFonts w:ascii="Symbol" w:hAnsi="Symbol" w:hint="default"/>
+      </w:rPr>
+    </w:lvl>
+    <w:lvl w:ilvl="5">
+      <w:start w:val="1"/>
+      <w:numFmt w:val="bullet"/>
+      <w:lvlText w:val=""/>
+      <w:lvlJc w:val="left"/>
+      <w:pPr>
+        <w:tabs>
+          <w:tab w:val="num" w:pos="4320"/>
+        </w:tabs>
+        <w:ind w:left="4320" w:hanging="360"/>
+      </w:pPr>
+      <w:rPr>
+        <w:rFonts w:ascii="Symbol" w:hAnsi="Symbol" w:hint="default"/>
+      </w:rPr>
+    </w:lvl>
+    <w:lvl w:ilvl="6">
+      <w:start w:val="1"/>
+      <w:numFmt w:val="bullet"/>
+      <w:lvlText w:val=""/>
+      <w:lvlJc w:val="left"/>
+      <w:pPr>
+        <w:tabs>
+          <w:tab w:val="num" w:pos="5040"/>
+        </w:tabs>
+        <w:ind w:left="5040" w:hanging="360"/>
+      </w:pPr>
+      <w:rPr>
+        <w:rFonts w:ascii="Symbol" w:hAnsi="Symbol" w:hint="default"/>
+      </w:rPr>
+    </w:lvl>
+    <w:lvl w:ilvl="7">
+      <w:start w:val="1"/>
+      <w:numFmt w:val="bullet"/>
+      <w:lvlText w:val=""/>
+      <w:lvlJc w:val="left"/>
+      <w:pPr>
+        <w:tabs>
+          <w:tab w:val="num" w:pos="5760"/>
+        </w:tabs>
+        <w:ind w:left="5760" w:hanging="360"/>
+      </w:pPr>
+      <w:rPr>
+        <w:rFonts w:ascii="Symbol" w:hAnsi="Symbol" w:hint="default"/>
+      </w:rPr>
+    </w:lvl>
+  </w:abstractNum>
+  <w:abstractNum w:abstractNumId="20">
+    <w:lvl w:ilvl="0">
+      <w:start w:val="1"/>
       <w:numFmt w:val="decimal"/>
       <w:lvlText w:val="%1."/>
       <w:lvlJc w:val="left"/>
@@ -11691,7 +12744,105 @@
       </w:pPr>
     </w:lvl>
   </w:abstractNum>
-  <w:abstractNum w:abstractNumId="19">
+  <w:abstractNum w:abstractNumId="21">
+    <w:lvl w:ilvl="0">
+      <w:start w:val="1"/>
+      <w:numFmt w:val="decimal"/>
+      <w:lvlText w:val="%1."/>
+      <w:lvlJc w:val="left"/>
+      <w:pPr>
+        <w:tabs>
+          <w:tab w:val="num" w:pos="720"/>
+        </w:tabs>
+        <w:ind w:left="720" w:hanging="360"/>
+      </w:pPr>
+    </w:lvl>
+    <w:lvl w:ilvl="1">
+      <w:start w:val="1"/>
+      <w:numFmt w:val="decimal"/>
+      <w:lvlText w:val="%2."/>
+      <w:lvlJc w:val="left"/>
+      <w:pPr>
+        <w:tabs>
+          <w:tab w:val="num" w:pos="1440"/>
+        </w:tabs>
+        <w:ind w:left="1440" w:hanging="360"/>
+      </w:pPr>
+    </w:lvl>
+    <w:lvl w:ilvl="2">
+      <w:start w:val="1"/>
+      <w:numFmt w:val="decimal"/>
+      <w:lvlText w:val="%3."/>
+      <w:lvlJc w:val="left"/>
+      <w:pPr>
+        <w:tabs>
+          <w:tab w:val="num" w:pos="2160"/>
+        </w:tabs>
+        <w:ind w:left="2160" w:hanging="360"/>
+      </w:pPr>
+    </w:lvl>
+    <w:lvl w:ilvl="3">
+      <w:start w:val="1"/>
+      <w:numFmt w:val="decimal"/>
+      <w:lvlText w:val="%4."/>
+      <w:lvlJc w:val="left"/>
+      <w:pPr>
+        <w:tabs>
+          <w:tab w:val="num" w:pos="2880"/>
+        </w:tabs>
+        <w:ind w:left="2880" w:hanging="360"/>
+      </w:pPr>
+    </w:lvl>
+    <w:lvl w:ilvl="4">
+      <w:start w:val="1"/>
+      <w:numFmt w:val="decimal"/>
+      <w:lvlText w:val="%5."/>
+      <w:lvlJc w:val="left"/>
+      <w:pPr>
+        <w:tabs>
+          <w:tab w:val="num" w:pos="3600"/>
+        </w:tabs>
+        <w:ind w:left="3600" w:hanging="360"/>
+      </w:pPr>
+    </w:lvl>
+    <w:lvl w:ilvl="5">
+      <w:start w:val="1"/>
+      <w:numFmt w:val="decimal"/>
+      <w:lvlText w:val="%6."/>
+      <w:lvlJc w:val="left"/>
+      <w:pPr>
+        <w:tabs>
+          <w:tab w:val="num" w:pos="4320"/>
+        </w:tabs>
+        <w:ind w:left="4320" w:hanging="360"/>
+      </w:pPr>
+    </w:lvl>
+    <w:lvl w:ilvl="6">
+      <w:start w:val="1"/>
+      <w:numFmt w:val="decimal"/>
+      <w:lvlText w:val="%7."/>
+      <w:lvlJc w:val="left"/>
+      <w:pPr>
+        <w:tabs>
+          <w:tab w:val="num" w:pos="5040"/>
+        </w:tabs>
+        <w:ind w:left="5040" w:hanging="360"/>
+      </w:pPr>
+    </w:lvl>
+    <w:lvl w:ilvl="7">
+      <w:start w:val="1"/>
+      <w:numFmt w:val="decimal"/>
+      <w:lvlText w:val="%8."/>
+      <w:lvlJc w:val="left"/>
+      <w:pPr>
+        <w:tabs>
+          <w:tab w:val="num" w:pos="5760"/>
+        </w:tabs>
+        <w:ind w:left="5760" w:hanging="360"/>
+      </w:pPr>
+    </w:lvl>
+  </w:abstractNum>
+  <w:abstractNum w:abstractNumId="22">
     <w:lvl w:ilvl="0">
       <w:start w:val="1"/>
       <w:numFmt w:val="bullet"/>
@@ -11869,6 +13020,15 @@
   </w:num>
   <w:num w:numId="19">
     <w:abstractNumId w:val="19"/>
+  </w:num>
+  <w:num w:numId="20">
+    <w:abstractNumId w:val="20"/>
+  </w:num>
+  <w:num w:numId="21">
+    <w:abstractNumId w:val="21"/>
+  </w:num>
+  <w:num w:numId="22">
+    <w:abstractNumId w:val="22"/>
   </w:num>
 </w:numbering>
 </file>

</xml_diff>